<commit_message>
Aplicar el formato exacto de la plantilla e insertar las tres figuras
Formato replicado del original: Poppins 42 azul 0084d5 en titulos, Open
Sans SemiBold 28 marino en subtitulos, cuerpo Open Sans 21 justificado con
sangria de 720, tablas Table2 con cabecera marino y bordes grises.
Las tres figuras quedan embebidas con su pie.

Co-Authored-By: Claude Fable 5 <noreply@anthropic.com>
Claude-Session: https://claude.ai/code/session_01DUfpVMYHsB8EzAou3Ubw1a
</commit_message>
<xml_diff>
--- a/documento/entregable/Metodologia-AI-DLC-v1.0.docx
+++ b/documento/entregable/Metodologia-AI-DLC-v1.0.docx
@@ -1,6 +1,6 @@
 
 <file path=word/document.xml><?xml version="1.0" encoding="utf-8"?>
-<w:document xmlns:ns2="http://schemas.openxmlformats.org/drawingml/2006/wordprocessingDrawing" xmlns:ns3="http://schemas.openxmlformats.org/drawingml/2006/main" xmlns:ns4="http://schemas.openxmlformats.org/drawingml/2006/picture" xmlns:ns6="urn:schemas-microsoft-com:vml" xmlns:ns7="urn:schemas-microsoft-com:office:office" xmlns:r="http://schemas.openxmlformats.org/officeDocument/2006/relationships" xmlns:w="http://schemas.openxmlformats.org/wordprocessingml/2006/main" xmlns:w14="http://schemas.microsoft.com/office/word/2010/wordml">
+<w:document xmlns:a="http://schemas.openxmlformats.org/drawingml/2006/main" xmlns:o="urn:schemas-microsoft-com:office:office" xmlns:pic="http://schemas.openxmlformats.org/drawingml/2006/picture" xmlns:r="http://schemas.openxmlformats.org/officeDocument/2006/relationships" xmlns:v="urn:schemas-microsoft-com:vml" xmlns:w="http://schemas.openxmlformats.org/wordprocessingml/2006/main" xmlns:w14="http://schemas.microsoft.com/office/word/2010/wordml" xmlns:wp="http://schemas.openxmlformats.org/drawingml/2006/wordprocessingDrawing">
   <w:body>
     <w:p>
       <w:pPr>
@@ -9,87 +9,87 @@
       <w:r>
         <w:rPr/>
         <w:drawing>
-          <ns2:anchor allowOverlap="1" behindDoc="1" distB="0" distT="0" distL="0" distR="0" hidden="0" layoutInCell="1" locked="0" relativeHeight="0" simplePos="0">
-            <ns2:simplePos x="0" y="0"/>
-            <ns2:positionH relativeFrom="page">
-              <ns2:posOffset>4589563</ns2:posOffset>
-            </ns2:positionH>
-            <ns2:positionV relativeFrom="page">
-              <ns2:posOffset>1002910</ns2:posOffset>
-            </ns2:positionV>
-            <ns2:extent cx="2535137" cy="802077"/>
-            <ns2:effectExtent b="0" l="0" r="0" t="0"/>
-            <ns2:wrapNone/>
-            <ns2:docPr id="8" name="image2.png"/>
-            <ns3:graphic>
-              <ns3:graphicData uri="http://schemas.openxmlformats.org/drawingml/2006/picture">
-                <ns4:pic>
-                  <ns4:nvPicPr>
-                    <ns4:cNvPr id="0" name="image2.png"/>
-                    <ns4:cNvPicPr preferRelativeResize="0"/>
-                  </ns4:nvPicPr>
-                  <ns4:blipFill>
-                    <ns3:blip r:embed="rId7"/>
-                    <ns3:srcRect b="0" l="0" r="0" t="0"/>
-                    <ns3:stretch>
-                      <ns3:fillRect/>
-                    </ns3:stretch>
-                  </ns4:blipFill>
-                  <ns4:spPr>
-                    <ns3:xfrm>
-                      <ns3:off x="0" y="0"/>
-                      <ns3:ext cx="2535137" cy="802077"/>
-                    </ns3:xfrm>
-                    <ns3:prstGeom prst="rect"/>
-                    <ns3:ln/>
-                  </ns4:spPr>
-                </ns4:pic>
-              </ns3:graphicData>
-            </ns3:graphic>
-          </ns2:anchor>
+          <wp:anchor allowOverlap="1" behindDoc="1" distB="0" distT="0" distL="0" distR="0" hidden="0" layoutInCell="1" locked="0" relativeHeight="0" simplePos="0">
+            <wp:simplePos x="0" y="0"/>
+            <wp:positionH relativeFrom="page">
+              <wp:posOffset>4589563</wp:posOffset>
+            </wp:positionH>
+            <wp:positionV relativeFrom="page">
+              <wp:posOffset>1002910</wp:posOffset>
+            </wp:positionV>
+            <wp:extent cx="2535137" cy="802077"/>
+            <wp:effectExtent b="0" l="0" r="0" t="0"/>
+            <wp:wrapNone/>
+            <wp:docPr id="8" name="image2.png"/>
+            <a:graphic>
+              <a:graphicData uri="http://schemas.openxmlformats.org/drawingml/2006/picture">
+                <pic:pic>
+                  <pic:nvPicPr>
+                    <pic:cNvPr id="0" name="image2.png"/>
+                    <pic:cNvPicPr preferRelativeResize="0"/>
+                  </pic:nvPicPr>
+                  <pic:blipFill>
+                    <a:blip r:embed="rId7"/>
+                    <a:srcRect b="0" l="0" r="0" t="0"/>
+                    <a:stretch>
+                      <a:fillRect/>
+                    </a:stretch>
+                  </pic:blipFill>
+                  <pic:spPr>
+                    <a:xfrm>
+                      <a:off x="0" y="0"/>
+                      <a:ext cx="2535137" cy="802077"/>
+                    </a:xfrm>
+                    <a:prstGeom prst="rect"/>
+                    <a:ln/>
+                  </pic:spPr>
+                </pic:pic>
+              </a:graphicData>
+            </a:graphic>
+          </wp:anchor>
         </w:drawing>
       </w:r>
       <w:r>
         <w:rPr/>
         <w:drawing>
-          <ns2:anchor allowOverlap="1" behindDoc="1" distB="0" distT="0" distL="0" distR="0" hidden="0" layoutInCell="1" locked="0" relativeHeight="0" simplePos="0">
-            <ns2:simplePos x="0" y="0"/>
-            <ns2:positionH relativeFrom="page">
-              <ns2:posOffset>-1290635</ns2:posOffset>
-            </ns2:positionH>
-            <ns2:positionV relativeFrom="page">
-              <ns2:posOffset>839410</ns2:posOffset>
-            </ns2:positionV>
-            <ns2:extent cx="4816665" cy="4716318"/>
-            <ns2:effectExtent b="775487" l="750752" r="750752" t="775487"/>
-            <ns2:wrapNone/>
-            <ns2:docPr id="9" name="image6.png"/>
-            <ns3:graphic>
-              <ns3:graphicData uri="http://schemas.openxmlformats.org/drawingml/2006/picture">
-                <ns4:pic>
-                  <ns4:nvPicPr>
-                    <ns4:cNvPr id="0" name="image6.png"/>
-                    <ns4:cNvPicPr preferRelativeResize="0"/>
-                  </ns4:nvPicPr>
-                  <ns4:blipFill>
-                    <ns3:blip r:embed="rId8"/>
-                    <ns3:srcRect b="0" l="0" r="0" t="0"/>
-                    <ns3:stretch>
-                      <ns3:fillRect/>
-                    </ns3:stretch>
-                  </ns4:blipFill>
-                  <ns4:spPr>
-                    <ns3:xfrm rot="1439456">
-                      <ns3:off x="0" y="0"/>
-                      <ns3:ext cx="4816665" cy="4716318"/>
-                    </ns3:xfrm>
-                    <ns3:prstGeom prst="rect"/>
-                    <ns3:ln/>
-                  </ns4:spPr>
-                </ns4:pic>
-              </ns3:graphicData>
-            </ns3:graphic>
-          </ns2:anchor>
+          <wp:anchor allowOverlap="1" behindDoc="1" distB="0" distT="0" distL="0" distR="0" hidden="0" layoutInCell="1" locked="0" relativeHeight="0" simplePos="0">
+            <wp:simplePos x="0" y="0"/>
+            <wp:positionH relativeFrom="page">
+              <wp:posOffset>-1290635</wp:posOffset>
+            </wp:positionH>
+            <wp:positionV relativeFrom="page">
+              <wp:posOffset>839410</wp:posOffset>
+            </wp:positionV>
+            <wp:extent cx="4816665" cy="4716318"/>
+            <wp:effectExtent b="775487" l="750752" r="750752" t="775487"/>
+            <wp:wrapNone/>
+            <wp:docPr id="9" name="image6.png"/>
+            <a:graphic>
+              <a:graphicData uri="http://schemas.openxmlformats.org/drawingml/2006/picture">
+                <pic:pic>
+                  <pic:nvPicPr>
+                    <pic:cNvPr id="0" name="image6.png"/>
+                    <pic:cNvPicPr preferRelativeResize="0"/>
+                  </pic:nvPicPr>
+                  <pic:blipFill>
+                    <a:blip r:embed="rId8"/>
+                    <a:srcRect b="0" l="0" r="0" t="0"/>
+                    <a:stretch>
+                      <a:fillRect/>
+                    </a:stretch>
+                  </pic:blipFill>
+                  <pic:spPr>
+                    <a:xfrm rot="1439456">
+                      <a:off x="0" y="0"/>
+                      <a:ext cx="4816665" cy="4716318"/>
+                    </a:xfrm>
+                    <a:prstGeom prst="rect"/>
+                    <a:ln/>
+                  </pic:spPr>
+                </pic:pic>
+              </a:graphicData>
+            </a:graphic>
+          </wp:anchor>
         </w:drawing>
       </w:r>
       <w:r>
@@ -176,44 +176,44 @@
       <w:r>
         <w:rPr/>
         <w:drawing>
-          <ns2:anchor allowOverlap="1" behindDoc="1" distB="0" distT="0" distL="0" distR="0" hidden="0" layoutInCell="1" locked="0" relativeHeight="0" simplePos="0">
-            <ns2:simplePos x="0" y="0"/>
-            <ns2:positionH relativeFrom="page">
-              <ns2:posOffset>-168502</ns2:posOffset>
-            </ns2:positionH>
-            <ns2:positionV relativeFrom="page">
-              <ns2:posOffset>2566988</ns2:posOffset>
-            </ns2:positionV>
-            <ns2:extent cx="6959830" cy="3121981"/>
-            <ns2:effectExtent b="0" l="0" r="0" t="0"/>
-            <ns2:wrapNone/>
-            <ns2:docPr id="10" name="image3.png"/>
-            <ns3:graphic>
-              <ns3:graphicData uri="http://schemas.openxmlformats.org/drawingml/2006/picture">
-                <ns4:pic>
-                  <ns4:nvPicPr>
-                    <ns4:cNvPr id="0" name="image3.png"/>
-                    <ns4:cNvPicPr preferRelativeResize="0"/>
-                  </ns4:nvPicPr>
-                  <ns4:blipFill>
-                    <ns3:blip r:embed="rId9"/>
-                    <ns3:srcRect b="0" l="0" r="0" t="0"/>
-                    <ns3:stretch>
-                      <ns3:fillRect/>
-                    </ns3:stretch>
-                  </ns4:blipFill>
-                  <ns4:spPr>
-                    <ns3:xfrm>
-                      <ns3:off x="0" y="0"/>
-                      <ns3:ext cx="6959830" cy="3121981"/>
-                    </ns3:xfrm>
-                    <ns3:prstGeom prst="rect"/>
-                    <ns3:ln/>
-                  </ns4:spPr>
-                </ns4:pic>
-              </ns3:graphicData>
-            </ns3:graphic>
-          </ns2:anchor>
+          <wp:anchor allowOverlap="1" behindDoc="1" distB="0" distT="0" distL="0" distR="0" hidden="0" layoutInCell="1" locked="0" relativeHeight="0" simplePos="0">
+            <wp:simplePos x="0" y="0"/>
+            <wp:positionH relativeFrom="page">
+              <wp:posOffset>-168502</wp:posOffset>
+            </wp:positionH>
+            <wp:positionV relativeFrom="page">
+              <wp:posOffset>2566988</wp:posOffset>
+            </wp:positionV>
+            <wp:extent cx="6959830" cy="3121981"/>
+            <wp:effectExtent b="0" l="0" r="0" t="0"/>
+            <wp:wrapNone/>
+            <wp:docPr id="10" name="image3.png"/>
+            <a:graphic>
+              <a:graphicData uri="http://schemas.openxmlformats.org/drawingml/2006/picture">
+                <pic:pic>
+                  <pic:nvPicPr>
+                    <pic:cNvPr id="0" name="image3.png"/>
+                    <pic:cNvPicPr preferRelativeResize="0"/>
+                  </pic:nvPicPr>
+                  <pic:blipFill>
+                    <a:blip r:embed="rId9"/>
+                    <a:srcRect b="0" l="0" r="0" t="0"/>
+                    <a:stretch>
+                      <a:fillRect/>
+                    </a:stretch>
+                  </pic:blipFill>
+                  <pic:spPr>
+                    <a:xfrm>
+                      <a:off x="0" y="0"/>
+                      <a:ext cx="6959830" cy="3121981"/>
+                    </a:xfrm>
+                    <a:prstGeom prst="rect"/>
+                    <a:ln/>
+                  </pic:spPr>
+                </pic:pic>
+              </a:graphicData>
+            </a:graphic>
+          </wp:anchor>
         </w:drawing>
       </w:r>
       <w:r>
@@ -310,44 +310,44 @@
           <w:szCs w:val="24"/>
         </w:rPr>
         <w:drawing>
-          <ns2:anchor allowOverlap="1" behindDoc="1" distB="0" distT="0" distL="0" distR="0" hidden="0" layoutInCell="1" locked="0" relativeHeight="0" simplePos="0">
-            <ns2:simplePos x="0" y="0"/>
-            <ns2:positionH relativeFrom="page">
-              <ns2:posOffset>447675</ns2:posOffset>
-            </ns2:positionH>
-            <ns2:positionV relativeFrom="page">
-              <ns2:posOffset>9144000</ns2:posOffset>
-            </ns2:positionV>
-            <ns2:extent cx="1394299" cy="163375"/>
-            <ns2:effectExtent b="0" l="0" r="0" t="0"/>
-            <ns2:wrapNone/>
-            <ns2:docPr descr="Recurso 3.png" id="11" name="image1.png"/>
-            <ns3:graphic>
-              <ns3:graphicData uri="http://schemas.openxmlformats.org/drawingml/2006/picture">
-                <ns4:pic>
-                  <ns4:nvPicPr>
-                    <ns4:cNvPr descr="Recurso 3.png" id="0" name="image1.png"/>
-                    <ns4:cNvPicPr preferRelativeResize="0"/>
-                  </ns4:nvPicPr>
-                  <ns4:blipFill>
-                    <ns3:blip r:embed="rId10"/>
-                    <ns3:srcRect b="0" l="0" r="0" t="0"/>
-                    <ns3:stretch>
-                      <ns3:fillRect/>
-                    </ns3:stretch>
-                  </ns4:blipFill>
-                  <ns4:spPr>
-                    <ns3:xfrm>
-                      <ns3:off x="0" y="0"/>
-                      <ns3:ext cx="1394299" cy="163375"/>
-                    </ns3:xfrm>
-                    <ns3:prstGeom prst="rect"/>
-                    <ns3:ln/>
-                  </ns4:spPr>
-                </ns4:pic>
-              </ns3:graphicData>
-            </ns3:graphic>
-          </ns2:anchor>
+          <wp:anchor allowOverlap="1" behindDoc="1" distB="0" distT="0" distL="0" distR="0" hidden="0" layoutInCell="1" locked="0" relativeHeight="0" simplePos="0">
+            <wp:simplePos x="0" y="0"/>
+            <wp:positionH relativeFrom="page">
+              <wp:posOffset>447675</wp:posOffset>
+            </wp:positionH>
+            <wp:positionV relativeFrom="page">
+              <wp:posOffset>9144000</wp:posOffset>
+            </wp:positionV>
+            <wp:extent cx="1394299" cy="163375"/>
+            <wp:effectExtent b="0" l="0" r="0" t="0"/>
+            <wp:wrapNone/>
+            <wp:docPr descr="Recurso 3.png" id="11" name="image1.png"/>
+            <a:graphic>
+              <a:graphicData uri="http://schemas.openxmlformats.org/drawingml/2006/picture">
+                <pic:pic>
+                  <pic:nvPicPr>
+                    <pic:cNvPr descr="Recurso 3.png" id="0" name="image1.png"/>
+                    <pic:cNvPicPr preferRelativeResize="0"/>
+                  </pic:nvPicPr>
+                  <pic:blipFill>
+                    <a:blip r:embed="rId10"/>
+                    <a:srcRect b="0" l="0" r="0" t="0"/>
+                    <a:stretch>
+                      <a:fillRect/>
+                    </a:stretch>
+                  </pic:blipFill>
+                  <pic:spPr>
+                    <a:xfrm>
+                      <a:off x="0" y="0"/>
+                      <a:ext cx="1394299" cy="163375"/>
+                    </a:xfrm>
+                    <a:prstGeom prst="rect"/>
+                    <a:ln/>
+                  </pic:spPr>
+                </pic:pic>
+              </a:graphicData>
+            </a:graphic>
+          </wp:anchor>
         </w:drawing>
       </w:r>
       <w:r>
@@ -457,7 +457,7 @@
             </w:r>
             <w:r>
               <w:pict>
-                <ns6:rect style="width:0.0pt;height:1.5pt" ns7:hr="t" ns7:hrstd="t" ns7:hralign="center" fillcolor="#A0A0A0" stroked="f"/>
+                <v:rect style="width:0.0pt;height:1.5pt" o:hr="t" o:hrstd="t" o:hralign="center" fillcolor="#A0A0A0" stroked="f"/>
               </w:pict>
             </w:r>
             <w:r>
@@ -584,63 +584,150 @@
     <w:p>
       <w:pPr>
         <w:pStyle w:val="Heading1"/>
+        <w:spacing w:after="120" w:before="240" w:line="240" w:lineRule="auto"/>
+        <w:ind w:left="720" w:firstLine="0"/>
+        <w:jc w:val="left"/>
+        <w:rPr>
+          <w:color w:val="0084d5"/>
+        </w:rPr>
       </w:pPr>
       <w:r>
         <w:br w:type="page"/>
       </w:r>
       <w:r>
+        <w:rPr>
+          <w:rFonts w:ascii="Poppins" w:cs="Poppins" w:eastAsia="Poppins" w:hAnsi="Poppins"/>
+          <w:b w:val="1"/>
+          <w:bCs w:val="1"/>
+          <w:color w:val="0084d5"/>
+          <w:sz w:val="42"/>
+          <w:szCs w:val="42"/>
+          <w:rtl w:val="0"/>
+        </w:rPr>
         <w:t xml:space="preserve">METODOLOGÍA AI-DLC</w:t>
       </w:r>
     </w:p>
     <w:p>
       <w:pPr>
         <w:pStyle w:val="Subtitle"/>
-      </w:pPr>
-      <w:r>
+        <w:spacing w:after="320" w:before="0" w:lineRule="auto"/>
+        <w:ind w:left="720" w:firstLine="0"/>
+        <w:jc w:val="left"/>
+        <w:rPr/>
+      </w:pPr>
+      <w:r>
+        <w:rPr>
+          <w:rFonts w:ascii="Open Sans" w:cs="Open Sans" w:eastAsia="Open Sans" w:hAnsi="Open Sans"/>
+          <w:color w:val="666666"/>
+          <w:sz w:val="26"/>
+          <w:szCs w:val="26"/>
+          <w:rtl w:val="0"/>
+        </w:rPr>
         <w:t xml:space="preserve">Cómo construimos software con IA generativa</w:t>
       </w:r>
     </w:p>
     <w:p>
-      <w:r>
+      <w:pPr>
+        <w:spacing w:after="200" w:before="0" w:lineRule="auto"/>
+        <w:ind w:left="720" w:firstLine="0"/>
+        <w:jc w:val="both"/>
+        <w:rPr/>
+      </w:pPr>
+      <w:r>
+        <w:rPr>
+          <w:rFonts w:ascii="Open Sans" w:cs="Open Sans" w:eastAsia="Open Sans" w:hAnsi="Open Sans"/>
+          <w:sz w:val="21"/>
+          <w:szCs w:val="21"/>
+          <w:rtl w:val="0"/>
+        </w:rPr>
         <w:t xml:space="preserve">AI-DLC es la metodología de AWS para construir software con IA generativa, publicada en julio de 2025. El proceso coloca a la IA en el centro del desarrollo: en cada actividad, la IA analiza el contexto, propone un plan y pregunta lo que no sabe. El equipo corrige y aprueba; con esa aprobación, la IA implementa.</w:t>
       </w:r>
     </w:p>
     <w:p>
-      <w:r>
+      <w:pPr>
+        <w:spacing w:after="200" w:before="0" w:lineRule="auto"/>
+        <w:ind w:left="720" w:firstLine="0"/>
+        <w:jc w:val="both"/>
+        <w:rPr/>
+      </w:pPr>
+      <w:r>
+        <w:rPr>
+          <w:rFonts w:ascii="Open Sans" w:cs="Open Sans" w:eastAsia="Open Sans" w:hAnsi="Open Sans"/>
+          <w:sz w:val="21"/>
+          <w:szCs w:val="21"/>
+          <w:rtl w:val="0"/>
+        </w:rPr>
         <w:t xml:space="preserve">Este documento describe cómo el equipo de IA Generativa aplica el método: qué trabajo entra al ciclo, con qué artefactos se trabaja, cómo se ordenan las fases, qué recorre un cambio y qué evidencia queda al final.</w:t>
       </w:r>
     </w:p>
     <w:p>
       <w:pPr>
         <w:pStyle w:val="Heading2"/>
-      </w:pPr>
-      <w:r>
+        <w:spacing w:after="120" w:before="360" w:lineRule="auto"/>
+        <w:ind w:left="720" w:firstLine="0"/>
+        <w:jc w:val="left"/>
+        <w:rPr>
+          <w:sz w:val="28"/>
+          <w:szCs w:val="28"/>
+        </w:rPr>
+      </w:pPr>
+      <w:r>
+        <w:rPr>
+          <w:rFonts w:ascii="Open Sans SemiBold" w:cs="Open Sans SemiBold" w:eastAsia="Open Sans SemiBold" w:hAnsi="Open Sans SemiBold"/>
+          <w:color w:val="282d68"/>
+          <w:sz w:val="28"/>
+          <w:szCs w:val="28"/>
+          <w:rtl w:val="0"/>
+        </w:rPr>
         <w:t xml:space="preserve">Contenido</w:t>
       </w:r>
     </w:p>
     <w:tbl>
       <w:tblPr>
-        <w:tblStyle w:val="Table3"/>
+        <w:tblStyle w:val="Table2"/>
         <w:tblW w:w="9360" w:type="dxa"/>
+        <w:jc w:val="left"/>
+        <w:tblInd w:w="720" w:type="dxa"/>
+        <w:tblBorders>
+          <w:top w:color="d9d9d9" w:space="0" w:sz="4" w:val="single"/>
+          <w:left w:color="d9d9d9" w:space="0" w:sz="4" w:val="single"/>
+          <w:bottom w:color="d9d9d9" w:space="0" w:sz="4" w:val="single"/>
+          <w:right w:color="d9d9d9" w:space="0" w:sz="4" w:val="single"/>
+          <w:insideH w:color="d9d9d9" w:space="0" w:sz="4" w:val="single"/>
+          <w:insideV w:color="d9d9d9" w:space="0" w:sz="4" w:val="single"/>
+        </w:tblBorders>
         <w:tblLayout w:type="fixed"/>
+        <w:tblLook w:val="0000"/>
       </w:tblPr>
       <w:tblGrid>
-        <w:gridCol w:w="2600"/>
-        <w:gridCol w:w="6760"/>
+        <w:gridCol w:w="2800"/>
+        <w:gridCol w:w="6560"/>
       </w:tblGrid>
       <w:tr>
         <w:trPr>
-          <w:tblHeader/>
+          <w:cantSplit w:val="0"/>
+          <w:tblHeader w:val="1"/>
         </w:trPr>
         <w:tc>
           <w:tcPr>
-            <w:tcW w:w="2600" w:type="dxa"/>
-          </w:tcPr>
-          <w:p>
-            <w:r>
-              <w:rPr>
-                <w:b w:val="1"/>
-                <w:bCs w:val="1"/>
+            <w:tcW w:w="2800" w:type="dxa"/>
+            <w:shd w:fill="282d68" w:val="clear"/>
+            <w:vAlign w:val="center"/>
+          </w:tcPr>
+          <w:p>
+            <w:pPr>
+              <w:spacing w:after="40" w:before="40" w:line="240" w:lineRule="auto"/>
+              <w:ind w:left="60" w:right="60" w:firstLine="0"/>
+              <w:jc w:val="left"/>
+              <w:rPr/>
+            </w:pPr>
+            <w:r>
+              <w:rPr>
+                <w:rFonts w:ascii="Open Sans SemiBold" w:cs="Open Sans SemiBold" w:eastAsia="Open Sans SemiBold" w:hAnsi="Open Sans SemiBold"/>
+                <w:color w:val="ffffff"/>
+                <w:sz w:val="18"/>
+                <w:szCs w:val="18"/>
+                <w:rtl w:val="0"/>
               </w:rPr>
               <w:t xml:space="preserve">Sección</w:t>
             </w:r>
@@ -648,13 +735,24 @@
         </w:tc>
         <w:tc>
           <w:tcPr>
-            <w:tcW w:w="6760" w:type="dxa"/>
-          </w:tcPr>
-          <w:p>
-            <w:r>
-              <w:rPr>
-                <w:b w:val="1"/>
-                <w:bCs w:val="1"/>
+            <w:tcW w:w="6560" w:type="dxa"/>
+            <w:shd w:fill="282d68" w:val="clear"/>
+            <w:vAlign w:val="center"/>
+          </w:tcPr>
+          <w:p>
+            <w:pPr>
+              <w:spacing w:after="40" w:before="40" w:line="240" w:lineRule="auto"/>
+              <w:ind w:left="60" w:right="60" w:firstLine="0"/>
+              <w:jc w:val="left"/>
+              <w:rPr/>
+            </w:pPr>
+            <w:r>
+              <w:rPr>
+                <w:rFonts w:ascii="Open Sans SemiBold" w:cs="Open Sans SemiBold" w:eastAsia="Open Sans SemiBold" w:hAnsi="Open Sans SemiBold"/>
+                <w:color w:val="ffffff"/>
+                <w:sz w:val="18"/>
+                <w:szCs w:val="18"/>
+                <w:rtl w:val="0"/>
               </w:rPr>
               <w:t xml:space="preserve">Contenido</w:t>
             </w:r>
@@ -662,198 +760,477 @@
         </w:tc>
       </w:tr>
       <w:tr>
-        <w:tc>
-          <w:tcPr>
-            <w:tcW w:w="2600" w:type="dxa"/>
-          </w:tcPr>
-          <w:p>
-            <w:r>
+        <w:trPr>
+          <w:cantSplit w:val="0"/>
+        </w:trPr>
+        <w:tc>
+          <w:tcPr>
+            <w:tcW w:w="2800" w:type="dxa"/>
+            <w:shd w:fill="ffffff" w:val="clear"/>
+            <w:vAlign w:val="center"/>
+          </w:tcPr>
+          <w:p>
+            <w:pPr>
+              <w:spacing w:after="40" w:before="40" w:line="240" w:lineRule="auto"/>
+              <w:ind w:left="60" w:right="60" w:firstLine="0"/>
+              <w:jc w:val="left"/>
+              <w:rPr/>
+            </w:pPr>
+            <w:r>
+              <w:rPr>
+                <w:rFonts w:ascii="Open Sans" w:cs="Open Sans" w:eastAsia="Open Sans" w:hAnsi="Open Sans"/>
+                <w:sz w:val="18"/>
+                <w:szCs w:val="18"/>
+                <w:rtl w:val="0"/>
+              </w:rPr>
               <w:t xml:space="preserve">1. El método</w:t>
             </w:r>
           </w:p>
         </w:tc>
         <w:tc>
           <w:tcPr>
-            <w:tcW w:w="6760" w:type="dxa"/>
-          </w:tcPr>
-          <w:p>
-            <w:r>
+            <w:tcW w:w="6560" w:type="dxa"/>
+            <w:shd w:fill="ffffff" w:val="clear"/>
+            <w:vAlign w:val="center"/>
+          </w:tcPr>
+          <w:p>
+            <w:pPr>
+              <w:spacing w:after="40" w:before="40" w:line="240" w:lineRule="auto"/>
+              <w:ind w:left="60" w:right="60" w:firstLine="0"/>
+              <w:jc w:val="left"/>
+              <w:rPr/>
+            </w:pPr>
+            <w:r>
+              <w:rPr>
+                <w:rFonts w:ascii="Open Sans" w:cs="Open Sans" w:eastAsia="Open Sans" w:hAnsi="Open Sans"/>
+                <w:sz w:val="18"/>
+                <w:szCs w:val="18"/>
+                <w:rtl w:val="0"/>
+              </w:rPr>
               <w:t xml:space="preserve">Qué es AI-DLC y en qué se apoya</w:t>
             </w:r>
           </w:p>
         </w:tc>
       </w:tr>
       <w:tr>
-        <w:tc>
-          <w:tcPr>
-            <w:tcW w:w="2600" w:type="dxa"/>
-          </w:tcPr>
-          <w:p>
-            <w:r>
+        <w:trPr>
+          <w:cantSplit w:val="0"/>
+        </w:trPr>
+        <w:tc>
+          <w:tcPr>
+            <w:tcW w:w="2800" w:type="dxa"/>
+            <w:shd w:fill="ffffff" w:val="clear"/>
+            <w:vAlign w:val="center"/>
+          </w:tcPr>
+          <w:p>
+            <w:pPr>
+              <w:spacing w:after="40" w:before="40" w:line="240" w:lineRule="auto"/>
+              <w:ind w:left="60" w:right="60" w:firstLine="0"/>
+              <w:jc w:val="left"/>
+              <w:rPr/>
+            </w:pPr>
+            <w:r>
+              <w:rPr>
+                <w:rFonts w:ascii="Open Sans" w:cs="Open Sans" w:eastAsia="Open Sans" w:hAnsi="Open Sans"/>
+                <w:sz w:val="18"/>
+                <w:szCs w:val="18"/>
+                <w:rtl w:val="0"/>
+              </w:rPr>
               <w:t xml:space="preserve">2. Alcance</w:t>
             </w:r>
           </w:p>
         </w:tc>
         <w:tc>
           <w:tcPr>
-            <w:tcW w:w="6760" w:type="dxa"/>
-          </w:tcPr>
-          <w:p>
-            <w:r>
+            <w:tcW w:w="6560" w:type="dxa"/>
+            <w:shd w:fill="ffffff" w:val="clear"/>
+            <w:vAlign w:val="center"/>
+          </w:tcPr>
+          <w:p>
+            <w:pPr>
+              <w:spacing w:after="40" w:before="40" w:line="240" w:lineRule="auto"/>
+              <w:ind w:left="60" w:right="60" w:firstLine="0"/>
+              <w:jc w:val="left"/>
+              <w:rPr/>
+            </w:pPr>
+            <w:r>
+              <w:rPr>
+                <w:rFonts w:ascii="Open Sans" w:cs="Open Sans" w:eastAsia="Open Sans" w:hAnsi="Open Sans"/>
+                <w:sz w:val="18"/>
+                <w:szCs w:val="18"/>
+                <w:rtl w:val="0"/>
+              </w:rPr>
               <w:t xml:space="preserve">Qué trabajo recorre el ciclo completo y qué queda fuera</w:t>
             </w:r>
           </w:p>
         </w:tc>
       </w:tr>
       <w:tr>
-        <w:tc>
-          <w:tcPr>
-            <w:tcW w:w="2600" w:type="dxa"/>
-          </w:tcPr>
-          <w:p>
-            <w:r>
+        <w:trPr>
+          <w:cantSplit w:val="0"/>
+        </w:trPr>
+        <w:tc>
+          <w:tcPr>
+            <w:tcW w:w="2800" w:type="dxa"/>
+            <w:shd w:fill="ffffff" w:val="clear"/>
+            <w:vAlign w:val="center"/>
+          </w:tcPr>
+          <w:p>
+            <w:pPr>
+              <w:spacing w:after="40" w:before="40" w:line="240" w:lineRule="auto"/>
+              <w:ind w:left="60" w:right="60" w:firstLine="0"/>
+              <w:jc w:val="left"/>
+              <w:rPr/>
+            </w:pPr>
+            <w:r>
+              <w:rPr>
+                <w:rFonts w:ascii="Open Sans" w:cs="Open Sans" w:eastAsia="Open Sans" w:hAnsi="Open Sans"/>
+                <w:sz w:val="18"/>
+                <w:szCs w:val="18"/>
+                <w:rtl w:val="0"/>
+              </w:rPr>
               <w:t xml:space="preserve">3. Artefactos</w:t>
             </w:r>
           </w:p>
         </w:tc>
         <w:tc>
           <w:tcPr>
-            <w:tcW w:w="6760" w:type="dxa"/>
-          </w:tcPr>
-          <w:p>
-            <w:r>
+            <w:tcW w:w="6560" w:type="dxa"/>
+            <w:shd w:fill="ffffff" w:val="clear"/>
+            <w:vAlign w:val="center"/>
+          </w:tcPr>
+          <w:p>
+            <w:pPr>
+              <w:spacing w:after="40" w:before="40" w:line="240" w:lineRule="auto"/>
+              <w:ind w:left="60" w:right="60" w:firstLine="0"/>
+              <w:jc w:val="left"/>
+              <w:rPr/>
+            </w:pPr>
+            <w:r>
+              <w:rPr>
+                <w:rFonts w:ascii="Open Sans" w:cs="Open Sans" w:eastAsia="Open Sans" w:hAnsi="Open Sans"/>
+                <w:sz w:val="18"/>
+                <w:szCs w:val="18"/>
+                <w:rtl w:val="0"/>
+              </w:rPr>
               <w:t xml:space="preserve">Las seis piezas con las que trabaja el método</w:t>
             </w:r>
           </w:p>
         </w:tc>
       </w:tr>
       <w:tr>
-        <w:tc>
-          <w:tcPr>
-            <w:tcW w:w="2600" w:type="dxa"/>
-          </w:tcPr>
-          <w:p>
-            <w:r>
+        <w:trPr>
+          <w:cantSplit w:val="0"/>
+        </w:trPr>
+        <w:tc>
+          <w:tcPr>
+            <w:tcW w:w="2800" w:type="dxa"/>
+            <w:shd w:fill="ffffff" w:val="clear"/>
+            <w:vAlign w:val="center"/>
+          </w:tcPr>
+          <w:p>
+            <w:pPr>
+              <w:spacing w:after="40" w:before="40" w:line="240" w:lineRule="auto"/>
+              <w:ind w:left="60" w:right="60" w:firstLine="0"/>
+              <w:jc w:val="left"/>
+              <w:rPr/>
+            </w:pPr>
+            <w:r>
+              <w:rPr>
+                <w:rFonts w:ascii="Open Sans" w:cs="Open Sans" w:eastAsia="Open Sans" w:hAnsi="Open Sans"/>
+                <w:sz w:val="18"/>
+                <w:szCs w:val="18"/>
+                <w:rtl w:val="0"/>
+              </w:rPr>
               <w:t xml:space="preserve">4. Fases y rituales</w:t>
             </w:r>
           </w:p>
         </w:tc>
         <w:tc>
           <w:tcPr>
-            <w:tcW w:w="6760" w:type="dxa"/>
-          </w:tcPr>
-          <w:p>
-            <w:r>
+            <w:tcW w:w="6560" w:type="dxa"/>
+            <w:shd w:fill="ffffff" w:val="clear"/>
+            <w:vAlign w:val="center"/>
+          </w:tcPr>
+          <w:p>
+            <w:pPr>
+              <w:spacing w:after="40" w:before="40" w:line="240" w:lineRule="auto"/>
+              <w:ind w:left="60" w:right="60" w:firstLine="0"/>
+              <w:jc w:val="left"/>
+              <w:rPr/>
+            </w:pPr>
+            <w:r>
+              <w:rPr>
+                <w:rFonts w:ascii="Open Sans" w:cs="Open Sans" w:eastAsia="Open Sans" w:hAnsi="Open Sans"/>
+                <w:sz w:val="18"/>
+                <w:szCs w:val="18"/>
+                <w:rtl w:val="0"/>
+              </w:rPr>
               <w:t xml:space="preserve">Cómo se ordena el trabajo y cómo trabaja el equipo</w:t>
             </w:r>
           </w:p>
         </w:tc>
       </w:tr>
       <w:tr>
-        <w:tc>
-          <w:tcPr>
-            <w:tcW w:w="2600" w:type="dxa"/>
-          </w:tcPr>
-          <w:p>
-            <w:r>
+        <w:trPr>
+          <w:cantSplit w:val="0"/>
+        </w:trPr>
+        <w:tc>
+          <w:tcPr>
+            <w:tcW w:w="2800" w:type="dxa"/>
+            <w:shd w:fill="ffffff" w:val="clear"/>
+            <w:vAlign w:val="center"/>
+          </w:tcPr>
+          <w:p>
+            <w:pPr>
+              <w:spacing w:after="40" w:before="40" w:line="240" w:lineRule="auto"/>
+              <w:ind w:left="60" w:right="60" w:firstLine="0"/>
+              <w:jc w:val="left"/>
+              <w:rPr/>
+            </w:pPr>
+            <w:r>
+              <w:rPr>
+                <w:rFonts w:ascii="Open Sans" w:cs="Open Sans" w:eastAsia="Open Sans" w:hAnsi="Open Sans"/>
+                <w:sz w:val="18"/>
+                <w:szCs w:val="18"/>
+                <w:rtl w:val="0"/>
+              </w:rPr>
               <w:t xml:space="preserve">5. El flujo</w:t>
             </w:r>
           </w:p>
         </w:tc>
         <w:tc>
           <w:tcPr>
-            <w:tcW w:w="6760" w:type="dxa"/>
-          </w:tcPr>
-          <w:p>
-            <w:r>
+            <w:tcW w:w="6560" w:type="dxa"/>
+            <w:shd w:fill="ffffff" w:val="clear"/>
+            <w:vAlign w:val="center"/>
+          </w:tcPr>
+          <w:p>
+            <w:pPr>
+              <w:spacing w:after="40" w:before="40" w:line="240" w:lineRule="auto"/>
+              <w:ind w:left="60" w:right="60" w:firstLine="0"/>
+              <w:jc w:val="left"/>
+              <w:rPr/>
+            </w:pPr>
+            <w:r>
+              <w:rPr>
+                <w:rFonts w:ascii="Open Sans" w:cs="Open Sans" w:eastAsia="Open Sans" w:hAnsi="Open Sans"/>
+                <w:sz w:val="18"/>
+                <w:szCs w:val="18"/>
+                <w:rtl w:val="0"/>
+              </w:rPr>
               <w:t xml:space="preserve">Los nueve pasos, del Intent al despliegue</w:t>
             </w:r>
           </w:p>
         </w:tc>
       </w:tr>
       <w:tr>
-        <w:tc>
-          <w:tcPr>
-            <w:tcW w:w="2600" w:type="dxa"/>
-          </w:tcPr>
-          <w:p>
-            <w:r>
+        <w:trPr>
+          <w:cantSplit w:val="0"/>
+        </w:trPr>
+        <w:tc>
+          <w:tcPr>
+            <w:tcW w:w="2800" w:type="dxa"/>
+            <w:shd w:fill="ffffff" w:val="clear"/>
+            <w:vAlign w:val="center"/>
+          </w:tcPr>
+          <w:p>
+            <w:pPr>
+              <w:spacing w:after="40" w:before="40" w:line="240" w:lineRule="auto"/>
+              <w:ind w:left="60" w:right="60" w:firstLine="0"/>
+              <w:jc w:val="left"/>
+              <w:rPr/>
+            </w:pPr>
+            <w:r>
+              <w:rPr>
+                <w:rFonts w:ascii="Open Sans" w:cs="Open Sans" w:eastAsia="Open Sans" w:hAnsi="Open Sans"/>
+                <w:sz w:val="18"/>
+                <w:szCs w:val="18"/>
+                <w:rtl w:val="0"/>
+              </w:rPr>
               <w:t xml:space="preserve">6. Herramientas y skills</w:t>
             </w:r>
           </w:p>
         </w:tc>
         <w:tc>
           <w:tcPr>
-            <w:tcW w:w="6760" w:type="dxa"/>
-          </w:tcPr>
-          <w:p>
-            <w:r>
+            <w:tcW w:w="6560" w:type="dxa"/>
+            <w:shd w:fill="ffffff" w:val="clear"/>
+            <w:vAlign w:val="center"/>
+          </w:tcPr>
+          <w:p>
+            <w:pPr>
+              <w:spacing w:after="40" w:before="40" w:line="240" w:lineRule="auto"/>
+              <w:ind w:left="60" w:right="60" w:firstLine="0"/>
+              <w:jc w:val="left"/>
+              <w:rPr/>
+            </w:pPr>
+            <w:r>
+              <w:rPr>
+                <w:rFonts w:ascii="Open Sans" w:cs="Open Sans" w:eastAsia="Open Sans" w:hAnsi="Open Sans"/>
+                <w:sz w:val="18"/>
+                <w:szCs w:val="18"/>
+                <w:rtl w:val="0"/>
+              </w:rPr>
               <w:t xml:space="preserve">Qué capacidad cubre cada fase y con qué se resuelve hoy</w:t>
             </w:r>
           </w:p>
         </w:tc>
       </w:tr>
       <w:tr>
-        <w:tc>
-          <w:tcPr>
-            <w:tcW w:w="2600" w:type="dxa"/>
-          </w:tcPr>
-          <w:p>
-            <w:r>
+        <w:trPr>
+          <w:cantSplit w:val="0"/>
+        </w:trPr>
+        <w:tc>
+          <w:tcPr>
+            <w:tcW w:w="2800" w:type="dxa"/>
+            <w:shd w:fill="ffffff" w:val="clear"/>
+            <w:vAlign w:val="center"/>
+          </w:tcPr>
+          <w:p>
+            <w:pPr>
+              <w:spacing w:after="40" w:before="40" w:line="240" w:lineRule="auto"/>
+              <w:ind w:left="60" w:right="60" w:firstLine="0"/>
+              <w:jc w:val="left"/>
+              <w:rPr/>
+            </w:pPr>
+            <w:r>
+              <w:rPr>
+                <w:rFonts w:ascii="Open Sans" w:cs="Open Sans" w:eastAsia="Open Sans" w:hAnsi="Open Sans"/>
+                <w:sz w:val="18"/>
+                <w:szCs w:val="18"/>
+                <w:rtl w:val="0"/>
+              </w:rPr>
               <w:t xml:space="preserve">7. Gobernanza</w:t>
             </w:r>
           </w:p>
         </w:tc>
         <w:tc>
           <w:tcPr>
-            <w:tcW w:w="6760" w:type="dxa"/>
-          </w:tcPr>
-          <w:p>
-            <w:r>
+            <w:tcW w:w="6560" w:type="dxa"/>
+            <w:shd w:fill="ffffff" w:val="clear"/>
+            <w:vAlign w:val="center"/>
+          </w:tcPr>
+          <w:p>
+            <w:pPr>
+              <w:spacing w:after="40" w:before="40" w:line="240" w:lineRule="auto"/>
+              <w:ind w:left="60" w:right="60" w:firstLine="0"/>
+              <w:jc w:val="left"/>
+              <w:rPr/>
+            </w:pPr>
+            <w:r>
+              <w:rPr>
+                <w:rFonts w:ascii="Open Sans" w:cs="Open Sans" w:eastAsia="Open Sans" w:hAnsi="Open Sans"/>
+                <w:sz w:val="18"/>
+                <w:szCs w:val="18"/>
+                <w:rtl w:val="0"/>
+              </w:rPr>
               <w:t xml:space="preserve">Qué controla el proceso y qué evidencia queda</w:t>
             </w:r>
           </w:p>
         </w:tc>
       </w:tr>
       <w:tr>
-        <w:tc>
-          <w:tcPr>
-            <w:tcW w:w="2600" w:type="dxa"/>
-          </w:tcPr>
-          <w:p>
-            <w:r>
+        <w:trPr>
+          <w:cantSplit w:val="0"/>
+        </w:trPr>
+        <w:tc>
+          <w:tcPr>
+            <w:tcW w:w="2800" w:type="dxa"/>
+            <w:shd w:fill="ffffff" w:val="clear"/>
+            <w:vAlign w:val="center"/>
+          </w:tcPr>
+          <w:p>
+            <w:pPr>
+              <w:spacing w:after="40" w:before="40" w:line="240" w:lineRule="auto"/>
+              <w:ind w:left="60" w:right="60" w:firstLine="0"/>
+              <w:jc w:val="left"/>
+              <w:rPr/>
+            </w:pPr>
+            <w:r>
+              <w:rPr>
+                <w:rFonts w:ascii="Open Sans" w:cs="Open Sans" w:eastAsia="Open Sans" w:hAnsi="Open Sans"/>
+                <w:sz w:val="18"/>
+                <w:szCs w:val="18"/>
+                <w:rtl w:val="0"/>
+              </w:rPr>
               <w:t xml:space="preserve">8. Adopción</w:t>
             </w:r>
           </w:p>
         </w:tc>
         <w:tc>
           <w:tcPr>
-            <w:tcW w:w="6760" w:type="dxa"/>
-          </w:tcPr>
-          <w:p>
-            <w:r>
+            <w:tcW w:w="6560" w:type="dxa"/>
+            <w:shd w:fill="ffffff" w:val="clear"/>
+            <w:vAlign w:val="center"/>
+          </w:tcPr>
+          <w:p>
+            <w:pPr>
+              <w:spacing w:after="40" w:before="40" w:line="240" w:lineRule="auto"/>
+              <w:ind w:left="60" w:right="60" w:firstLine="0"/>
+              <w:jc w:val="left"/>
+              <w:rPr/>
+            </w:pPr>
+            <w:r>
+              <w:rPr>
+                <w:rFonts w:ascii="Open Sans" w:cs="Open Sans" w:eastAsia="Open Sans" w:hAnsi="Open Sans"/>
+                <w:sz w:val="18"/>
+                <w:szCs w:val="18"/>
+                <w:rtl w:val="0"/>
+              </w:rPr>
               <w:t xml:space="preserve">Cómo se incorpora el equipo al método</w:t>
             </w:r>
           </w:p>
         </w:tc>
       </w:tr>
       <w:tr>
-        <w:tc>
-          <w:tcPr>
-            <w:tcW w:w="2600" w:type="dxa"/>
-          </w:tcPr>
-          <w:p>
-            <w:r>
+        <w:trPr>
+          <w:cantSplit w:val="0"/>
+        </w:trPr>
+        <w:tc>
+          <w:tcPr>
+            <w:tcW w:w="2800" w:type="dxa"/>
+            <w:shd w:fill="ffffff" w:val="clear"/>
+            <w:vAlign w:val="center"/>
+          </w:tcPr>
+          <w:p>
+            <w:pPr>
+              <w:spacing w:after="40" w:before="40" w:line="240" w:lineRule="auto"/>
+              <w:ind w:left="60" w:right="60" w:firstLine="0"/>
+              <w:jc w:val="left"/>
+              <w:rPr/>
+            </w:pPr>
+            <w:r>
+              <w:rPr>
+                <w:rFonts w:ascii="Open Sans" w:cs="Open Sans" w:eastAsia="Open Sans" w:hAnsi="Open Sans"/>
+                <w:sz w:val="18"/>
+                <w:szCs w:val="18"/>
+                <w:rtl w:val="0"/>
+              </w:rPr>
               <w:t xml:space="preserve">Referencias</w:t>
             </w:r>
           </w:p>
         </w:tc>
         <w:tc>
           <w:tcPr>
-            <w:tcW w:w="6760" w:type="dxa"/>
-          </w:tcPr>
-          <w:p>
-            <w:r>
+            <w:tcW w:w="6560" w:type="dxa"/>
+            <w:shd w:fill="ffffff" w:val="clear"/>
+            <w:vAlign w:val="center"/>
+          </w:tcPr>
+          <w:p>
+            <w:pPr>
+              <w:spacing w:after="40" w:before="40" w:line="240" w:lineRule="auto"/>
+              <w:ind w:left="60" w:right="60" w:firstLine="0"/>
+              <w:jc w:val="left"/>
+              <w:rPr/>
+            </w:pPr>
+            <w:r>
+              <w:rPr>
+                <w:rFonts w:ascii="Open Sans" w:cs="Open Sans" w:eastAsia="Open Sans" w:hAnsi="Open Sans"/>
+                <w:sz w:val="18"/>
+                <w:szCs w:val="18"/>
+                <w:rtl w:val="0"/>
+              </w:rPr>
               <w:t xml:space="preserve">Fuentes del método y políticas aplicables</w:t>
             </w:r>
           </w:p>
@@ -863,56 +1240,186 @@
     <w:p>
       <w:pPr>
         <w:pStyle w:val="Heading1"/>
+        <w:spacing w:after="120" w:before="240" w:line="240" w:lineRule="auto"/>
+        <w:ind w:left="720" w:firstLine="0"/>
+        <w:jc w:val="left"/>
+        <w:rPr>
+          <w:color w:val="0084d5"/>
+        </w:rPr>
       </w:pPr>
       <w:r>
         <w:br w:type="page"/>
       </w:r>
       <w:r>
+        <w:rPr>
+          <w:rFonts w:ascii="Poppins" w:cs="Poppins" w:eastAsia="Poppins" w:hAnsi="Poppins"/>
+          <w:b w:val="1"/>
+          <w:bCs w:val="1"/>
+          <w:color w:val="0084d5"/>
+          <w:sz w:val="42"/>
+          <w:szCs w:val="42"/>
+          <w:rtl w:val="0"/>
+        </w:rPr>
         <w:t xml:space="preserve">1. EL MÉTODO</w:t>
       </w:r>
     </w:p>
     <w:p>
-      <w:r>
+      <w:pPr>
+        <w:spacing w:after="200" w:before="0" w:lineRule="auto"/>
+        <w:ind w:left="720" w:firstLine="0"/>
+        <w:jc w:val="both"/>
+        <w:rPr/>
+      </w:pPr>
+      <w:r>
+        <w:rPr>
+          <w:rFonts w:ascii="Open Sans" w:cs="Open Sans" w:eastAsia="Open Sans" w:hAnsi="Open Sans"/>
+          <w:sz w:val="21"/>
+          <w:szCs w:val="21"/>
+          <w:rtl w:val="0"/>
+        </w:rPr>
         <w:t xml:space="preserve">AI-DLC es la metodología de AWS para construir software con IA generativa, publicada en julio de 2025. El proceso coloca a la IA en el centro del desarrollo: en cada actividad, la IA analiza el contexto, propone un plan y pregunta lo que no sabe. El equipo corrige y aprueba; con esa aprobación, la IA implementa. El mismo ciclo gobierna los requisitos, el diseño, el código, las pruebas y el despliegue.</w:t>
       </w:r>
     </w:p>
     <w:p>
       <w:pPr>
-        <w:spacing w:before="240" w:after="240"/>
+        <w:spacing w:after="80" w:before="240" w:lineRule="auto"/>
+        <w:ind w:left="720" w:firstLine="0"/>
         <w:jc w:val="center"/>
-      </w:pPr>
-      <w:r>
-        <w:rPr>
+        <w:rPr/>
+      </w:pPr>
+      <w:r>
+        <w:rPr>
+          <w:rtl w:val="0"/>
+        </w:rPr>
+        <w:drawing>
+          <wp:inline distB="0" distT="0" distL="0" distR="0">
+            <wp:extent cx="5120640" cy="3929793"/>
+            <wp:effectExtent b="0" l="0" r="0" t="0"/>
+            <wp:docPr id="4337" name="figura1.png"/>
+            <a:graphic>
+              <a:graphicData uri="http://schemas.openxmlformats.org/drawingml/2006/picture">
+                <pic:pic>
+                  <pic:nvPicPr>
+                    <pic:cNvPr id="0" name="figura1.png"/>
+                    <pic:cNvPicPr preferRelativeResize="0"/>
+                  </pic:nvPicPr>
+                  <pic:blipFill>
+                    <a:blip r:embed="rId15"/>
+                    <a:srcRect b="0" l="0" r="0" t="0"/>
+                    <a:stretch>
+                      <a:fillRect/>
+                    </a:stretch>
+                  </pic:blipFill>
+                  <pic:spPr>
+                    <a:xfrm>
+                      <a:off x="0" y="0"/>
+                      <a:ext cx="5120640" cy="3929793"/>
+                    </a:xfrm>
+                    <a:prstGeom prst="rect">
+                      <a:avLst/>
+                    </a:prstGeom>
+                  </pic:spPr>
+                </pic:pic>
+              </a:graphicData>
+            </a:graphic>
+          </wp:inline>
+        </w:drawing>
+      </w:r>
+    </w:p>
+    <w:p>
+      <w:pPr>
+        <w:spacing w:after="240" w:before="0" w:lineRule="auto"/>
+        <w:ind w:left="720" w:firstLine="0"/>
+        <w:jc w:val="center"/>
+        <w:rPr/>
+      </w:pPr>
+      <w:r>
+        <w:rPr>
+          <w:rFonts w:ascii="Open Sans" w:cs="Open Sans" w:eastAsia="Open Sans" w:hAnsi="Open Sans"/>
           <w:i w:val="1"/>
           <w:iCs w:val="1"/>
           <w:color w:val="666666"/>
-        </w:rPr>
-        <w:t xml:space="preserve">[Figura 1 — La IA propone, el equipo decide]</w:t>
-      </w:r>
-    </w:p>
-    <w:p>
-      <w:r>
+          <w:sz w:val="18"/>
+          <w:szCs w:val="18"/>
+          <w:rtl w:val="0"/>
+        </w:rPr>
+        <w:t xml:space="preserve">Figura 1. La IA propone, el equipo decide.</w:t>
+      </w:r>
+    </w:p>
+    <w:p>
+      <w:pPr>
+        <w:spacing w:after="200" w:before="0" w:lineRule="auto"/>
+        <w:ind w:left="720" w:firstLine="0"/>
+        <w:jc w:val="both"/>
+        <w:rPr/>
+      </w:pPr>
+      <w:r>
+        <w:rPr>
+          <w:rFonts w:ascii="Open Sans" w:cs="Open Sans" w:eastAsia="Open Sans" w:hAnsi="Open Sans"/>
+          <w:sz w:val="21"/>
+          <w:szCs w:val="21"/>
+          <w:rtl w:val="0"/>
+        </w:rPr>
         <w:t xml:space="preserve">El método nace de un límite que a menudo afecta al equipo de desarrollo: el asistente que autocompleta hace tareas sueltas sin contexto del sistema, y la IA que construye sola entrega software que nadie puede defender ante un cliente. AI-DLC evita los dos extremos: la IA hace el trabajo, una persona toma cada decisión.</w:t>
       </w:r>
     </w:p>
     <w:p>
       <w:pPr>
         <w:pStyle w:val="Heading1"/>
+        <w:spacing w:after="120" w:before="240" w:line="240" w:lineRule="auto"/>
+        <w:ind w:left="720" w:firstLine="0"/>
+        <w:jc w:val="left"/>
+        <w:rPr>
+          <w:color w:val="0084d5"/>
+        </w:rPr>
       </w:pPr>
       <w:r>
         <w:br w:type="page"/>
       </w:r>
       <w:r>
+        <w:rPr>
+          <w:rFonts w:ascii="Poppins" w:cs="Poppins" w:eastAsia="Poppins" w:hAnsi="Poppins"/>
+          <w:b w:val="1"/>
+          <w:bCs w:val="1"/>
+          <w:color w:val="0084d5"/>
+          <w:sz w:val="42"/>
+          <w:szCs w:val="42"/>
+          <w:rtl w:val="0"/>
+        </w:rPr>
         <w:t xml:space="preserve">2. ALCANCE: CUÁNDO APLICA Y CUÁNDO NO</w:t>
       </w:r>
     </w:p>
     <w:p>
-      <w:r>
+      <w:pPr>
+        <w:spacing w:after="200" w:before="0" w:lineRule="auto"/>
+        <w:ind w:left="720" w:firstLine="0"/>
+        <w:jc w:val="both"/>
+        <w:rPr/>
+      </w:pPr>
+      <w:r>
+        <w:rPr>
+          <w:rFonts w:ascii="Open Sans" w:cs="Open Sans" w:eastAsia="Open Sans" w:hAnsi="Open Sans"/>
+          <w:sz w:val="21"/>
+          <w:szCs w:val="21"/>
+          <w:rtl w:val="0"/>
+        </w:rPr>
         <w:t xml:space="preserve">El ciclo completo está pensado para sistemas con complejidad de arquitectura, decisiones de diseño que negociar y exigencias de escala, integración o cumplimiento. El trabajo simple no lo necesita.</w:t>
       </w:r>
     </w:p>
     <w:p>
-      <w:r>
+      <w:pPr>
+        <w:spacing w:after="200" w:before="0" w:lineRule="auto"/>
+        <w:ind w:left="720" w:firstLine="0"/>
+        <w:jc w:val="both"/>
+        <w:rPr/>
+      </w:pPr>
+      <w:r>
+        <w:rPr>
+          <w:rFonts w:ascii="Open Sans" w:cs="Open Sans" w:eastAsia="Open Sans" w:hAnsi="Open Sans"/>
+          <w:sz w:val="21"/>
+          <w:szCs w:val="21"/>
+          <w:rtl w:val="0"/>
+        </w:rPr>
         <w:t xml:space="preserve">El alcance se decide por cambio, no por proyecto. Un cambio recorre el ciclo completo si cumple al menos una de estas condiciones:</w:t>
       </w:r>
     </w:p>
@@ -922,9 +1429,18 @@
           <w:ilvl w:val="0"/>
           <w:numId w:val="1"/>
         </w:numPr>
-        <w:ind w:left="720" w:hanging="360"/>
-      </w:pPr>
-      <w:r>
+        <w:spacing w:after="80" w:before="0" w:lineRule="auto"/>
+        <w:ind w:left="1080" w:hanging="360"/>
+        <w:jc w:val="left"/>
+        <w:rPr/>
+      </w:pPr>
+      <w:r>
+        <w:rPr>
+          <w:rFonts w:ascii="Open Sans" w:cs="Open Sans" w:eastAsia="Open Sans" w:hAnsi="Open Sans"/>
+          <w:sz w:val="21"/>
+          <w:szCs w:val="21"/>
+          <w:rtl w:val="0"/>
+        </w:rPr>
         <w:t xml:space="preserve">cambia un flujo de negocio;</w:t>
       </w:r>
     </w:p>
@@ -934,9 +1450,18 @@
           <w:ilvl w:val="0"/>
           <w:numId w:val="1"/>
         </w:numPr>
-        <w:ind w:left="720" w:hanging="360"/>
-      </w:pPr>
-      <w:r>
+        <w:spacing w:after="80" w:before="0" w:lineRule="auto"/>
+        <w:ind w:left="1080" w:hanging="360"/>
+        <w:jc w:val="left"/>
+        <w:rPr/>
+      </w:pPr>
+      <w:r>
+        <w:rPr>
+          <w:rFonts w:ascii="Open Sans" w:cs="Open Sans" w:eastAsia="Open Sans" w:hAnsi="Open Sans"/>
+          <w:sz w:val="21"/>
+          <w:szCs w:val="21"/>
+          <w:rtl w:val="0"/>
+        </w:rPr>
         <w:t xml:space="preserve">toca más de un componente;</w:t>
       </w:r>
     </w:p>
@@ -946,9 +1471,18 @@
           <w:ilvl w:val="0"/>
           <w:numId w:val="1"/>
         </w:numPr>
-        <w:ind w:left="720" w:hanging="360"/>
-      </w:pPr>
-      <w:r>
+        <w:spacing w:after="80" w:before="0" w:lineRule="auto"/>
+        <w:ind w:left="1080" w:hanging="360"/>
+        <w:jc w:val="left"/>
+        <w:rPr/>
+      </w:pPr>
+      <w:r>
+        <w:rPr>
+          <w:rFonts w:ascii="Open Sans" w:cs="Open Sans" w:eastAsia="Open Sans" w:hAnsi="Open Sans"/>
+          <w:sz w:val="21"/>
+          <w:szCs w:val="21"/>
+          <w:rtl w:val="0"/>
+        </w:rPr>
         <w:t xml:space="preserve">lleva más de dos días de trabajo;</w:t>
       </w:r>
     </w:p>
@@ -958,64 +1492,156 @@
           <w:ilvl w:val="0"/>
           <w:numId w:val="1"/>
         </w:numPr>
-        <w:ind w:left="720" w:hanging="360"/>
-      </w:pPr>
-      <w:r>
+        <w:spacing w:after="80" w:before="0" w:lineRule="auto"/>
+        <w:ind w:left="1080" w:hanging="360"/>
+        <w:jc w:val="left"/>
+        <w:rPr/>
+      </w:pPr>
+      <w:r>
+        <w:rPr>
+          <w:rFonts w:ascii="Open Sans" w:cs="Open Sans" w:eastAsia="Open Sans" w:hAnsi="Open Sans"/>
+          <w:sz w:val="21"/>
+          <w:szCs w:val="21"/>
+          <w:rtl w:val="0"/>
+        </w:rPr>
         <w:t xml:space="preserve">automatiza una decisión que afecta a una persona.</w:t>
       </w:r>
     </w:p>
     <w:p>
-      <w:r>
+      <w:pPr>
+        <w:spacing w:after="0" w:before="0"/>
+        <w:ind w:left="720" w:firstLine="0"/>
+        <w:rPr/>
+      </w:pPr>
+    </w:p>
+    <w:p>
+      <w:pPr>
+        <w:spacing w:after="200" w:before="0" w:lineRule="auto"/>
+        <w:ind w:left="720" w:firstLine="0"/>
+        <w:jc w:val="both"/>
+        <w:rPr/>
+      </w:pPr>
+      <w:r>
+        <w:rPr>
+          <w:rFonts w:ascii="Open Sans" w:cs="Open Sans" w:eastAsia="Open Sans" w:hAnsi="Open Sans"/>
+          <w:sz w:val="21"/>
+          <w:szCs w:val="21"/>
+          <w:rtl w:val="0"/>
+        </w:rPr>
         <w:t xml:space="preserve">Si no cumple ninguna, entra directo a la construcción con el ticket como única especificación.</w:t>
       </w:r>
     </w:p>
     <w:p>
       <w:pPr>
         <w:pStyle w:val="Heading1"/>
+        <w:spacing w:after="120" w:before="240" w:line="240" w:lineRule="auto"/>
+        <w:ind w:left="720" w:firstLine="0"/>
+        <w:jc w:val="left"/>
+        <w:rPr>
+          <w:color w:val="0084d5"/>
+        </w:rPr>
       </w:pPr>
       <w:r>
         <w:br w:type="page"/>
       </w:r>
       <w:r>
+        <w:rPr>
+          <w:rFonts w:ascii="Poppins" w:cs="Poppins" w:eastAsia="Poppins" w:hAnsi="Poppins"/>
+          <w:b w:val="1"/>
+          <w:bCs w:val="1"/>
+          <w:color w:val="0084d5"/>
+          <w:sz w:val="42"/>
+          <w:szCs w:val="42"/>
+          <w:rtl w:val="0"/>
+        </w:rPr>
         <w:t xml:space="preserve">3. ARTEFACTOS</w:t>
       </w:r>
     </w:p>
     <w:p>
-      <w:r>
+      <w:pPr>
+        <w:spacing w:after="200" w:before="0" w:lineRule="auto"/>
+        <w:ind w:left="720" w:firstLine="0"/>
+        <w:jc w:val="both"/>
+        <w:rPr/>
+      </w:pPr>
+      <w:r>
+        <w:rPr>
+          <w:rFonts w:ascii="Open Sans" w:cs="Open Sans" w:eastAsia="Open Sans" w:hAnsi="Open Sans"/>
+          <w:sz w:val="21"/>
+          <w:szCs w:val="21"/>
+          <w:rtl w:val="0"/>
+        </w:rPr>
         <w:t xml:space="preserve">Un artefacto es una pieza concreta del ciclo: algo que se define, se aprueba y queda registrado. Son seis. Tres organizan el trabajo y tres son el producto de la construcción.</w:t>
       </w:r>
     </w:p>
     <w:p>
       <w:pPr>
         <w:pStyle w:val="Heading2"/>
-      </w:pPr>
-      <w:r>
+        <w:spacing w:after="120" w:before="360" w:lineRule="auto"/>
+        <w:ind w:left="720" w:firstLine="0"/>
+        <w:jc w:val="left"/>
+        <w:rPr>
+          <w:sz w:val="28"/>
+          <w:szCs w:val="28"/>
+        </w:rPr>
+      </w:pPr>
+      <w:r>
+        <w:rPr>
+          <w:rFonts w:ascii="Open Sans SemiBold" w:cs="Open Sans SemiBold" w:eastAsia="Open Sans SemiBold" w:hAnsi="Open Sans SemiBold"/>
+          <w:color w:val="282d68"/>
+          <w:sz w:val="28"/>
+          <w:szCs w:val="28"/>
+          <w:rtl w:val="0"/>
+        </w:rPr>
         <w:t xml:space="preserve">Los que organizan el trabajo</w:t>
       </w:r>
     </w:p>
     <w:tbl>
       <w:tblPr>
-        <w:tblStyle w:val="Table3"/>
+        <w:tblStyle w:val="Table2"/>
         <w:tblW w:w="9360" w:type="dxa"/>
+        <w:jc w:val="left"/>
+        <w:tblInd w:w="720" w:type="dxa"/>
+        <w:tblBorders>
+          <w:top w:color="d9d9d9" w:space="0" w:sz="4" w:val="single"/>
+          <w:left w:color="d9d9d9" w:space="0" w:sz="4" w:val="single"/>
+          <w:bottom w:color="d9d9d9" w:space="0" w:sz="4" w:val="single"/>
+          <w:right w:color="d9d9d9" w:space="0" w:sz="4" w:val="single"/>
+          <w:insideH w:color="d9d9d9" w:space="0" w:sz="4" w:val="single"/>
+          <w:insideV w:color="d9d9d9" w:space="0" w:sz="4" w:val="single"/>
+        </w:tblBorders>
         <w:tblLayout w:type="fixed"/>
+        <w:tblLook w:val="0000"/>
       </w:tblPr>
       <w:tblGrid>
-        <w:gridCol w:w="2000"/>
-        <w:gridCol w:w="7360"/>
+        <w:gridCol w:w="2200"/>
+        <w:gridCol w:w="7160"/>
       </w:tblGrid>
       <w:tr>
         <w:trPr>
-          <w:tblHeader/>
+          <w:cantSplit w:val="0"/>
+          <w:tblHeader w:val="1"/>
         </w:trPr>
         <w:tc>
           <w:tcPr>
-            <w:tcW w:w="2000" w:type="dxa"/>
-          </w:tcPr>
-          <w:p>
-            <w:r>
-              <w:rPr>
-                <w:b w:val="1"/>
-                <w:bCs w:val="1"/>
+            <w:tcW w:w="2200" w:type="dxa"/>
+            <w:shd w:fill="282d68" w:val="clear"/>
+            <w:vAlign w:val="center"/>
+          </w:tcPr>
+          <w:p>
+            <w:pPr>
+              <w:spacing w:after="40" w:before="40" w:line="240" w:lineRule="auto"/>
+              <w:ind w:left="60" w:right="60" w:firstLine="0"/>
+              <w:jc w:val="left"/>
+              <w:rPr/>
+            </w:pPr>
+            <w:r>
+              <w:rPr>
+                <w:rFonts w:ascii="Open Sans SemiBold" w:cs="Open Sans SemiBold" w:eastAsia="Open Sans SemiBold" w:hAnsi="Open Sans SemiBold"/>
+                <w:color w:val="ffffff"/>
+                <w:sz w:val="18"/>
+                <w:szCs w:val="18"/>
+                <w:rtl w:val="0"/>
               </w:rPr>
               <w:t xml:space="preserve">Artefacto</w:t>
             </w:r>
@@ -1023,13 +1649,24 @@
         </w:tc>
         <w:tc>
           <w:tcPr>
-            <w:tcW w:w="7360" w:type="dxa"/>
-          </w:tcPr>
-          <w:p>
-            <w:r>
-              <w:rPr>
-                <w:b w:val="1"/>
-                <w:bCs w:val="1"/>
+            <w:tcW w:w="7160" w:type="dxa"/>
+            <w:shd w:fill="282d68" w:val="clear"/>
+            <w:vAlign w:val="center"/>
+          </w:tcPr>
+          <w:p>
+            <w:pPr>
+              <w:spacing w:after="40" w:before="40" w:line="240" w:lineRule="auto"/>
+              <w:ind w:left="60" w:right="60" w:firstLine="0"/>
+              <w:jc w:val="left"/>
+              <w:rPr/>
+            </w:pPr>
+            <w:r>
+              <w:rPr>
+                <w:rFonts w:ascii="Open Sans SemiBold" w:cs="Open Sans SemiBold" w:eastAsia="Open Sans SemiBold" w:hAnsi="Open Sans SemiBold"/>
+                <w:color w:val="ffffff"/>
+                <w:sz w:val="18"/>
+                <w:szCs w:val="18"/>
+                <w:rtl w:val="0"/>
               </w:rPr>
               <w:t xml:space="preserve">Qué es</w:t>
             </w:r>
@@ -1037,66 +1674,159 @@
         </w:tc>
       </w:tr>
       <w:tr>
-        <w:tc>
-          <w:tcPr>
-            <w:tcW w:w="2000" w:type="dxa"/>
-          </w:tcPr>
-          <w:p>
-            <w:r>
+        <w:trPr>
+          <w:cantSplit w:val="0"/>
+        </w:trPr>
+        <w:tc>
+          <w:tcPr>
+            <w:tcW w:w="2200" w:type="dxa"/>
+            <w:shd w:fill="ffffff" w:val="clear"/>
+            <w:vAlign w:val="center"/>
+          </w:tcPr>
+          <w:p>
+            <w:pPr>
+              <w:spacing w:after="40" w:before="40" w:line="240" w:lineRule="auto"/>
+              <w:ind w:left="60" w:right="60" w:firstLine="0"/>
+              <w:jc w:val="left"/>
+              <w:rPr/>
+            </w:pPr>
+            <w:r>
+              <w:rPr>
+                <w:rFonts w:ascii="Open Sans" w:cs="Open Sans" w:eastAsia="Open Sans" w:hAnsi="Open Sans"/>
+                <w:sz w:val="18"/>
+                <w:szCs w:val="18"/>
+                <w:rtl w:val="0"/>
+              </w:rPr>
               <w:t xml:space="preserve">Intent</w:t>
             </w:r>
           </w:p>
         </w:tc>
         <w:tc>
           <w:tcPr>
-            <w:tcW w:w="7360" w:type="dxa"/>
-          </w:tcPr>
-          <w:p>
-            <w:r>
+            <w:tcW w:w="7160" w:type="dxa"/>
+            <w:shd w:fill="ffffff" w:val="clear"/>
+            <w:vAlign w:val="center"/>
+          </w:tcPr>
+          <w:p>
+            <w:pPr>
+              <w:spacing w:after="40" w:before="40" w:line="240" w:lineRule="auto"/>
+              <w:ind w:left="60" w:right="60" w:firstLine="0"/>
+              <w:jc w:val="left"/>
+              <w:rPr/>
+            </w:pPr>
+            <w:r>
+              <w:rPr>
+                <w:rFonts w:ascii="Open Sans" w:cs="Open Sans" w:eastAsia="Open Sans" w:hAnsi="Open Sans"/>
+                <w:sz w:val="18"/>
+                <w:szCs w:val="18"/>
+                <w:rtl w:val="0"/>
+              </w:rPr>
               <w:t xml:space="preserve">Lo que se quiere lograr, dicho en términos de negocio. El equipo define el destino y la IA propone el camino.</w:t>
             </w:r>
           </w:p>
         </w:tc>
       </w:tr>
       <w:tr>
-        <w:tc>
-          <w:tcPr>
-            <w:tcW w:w="2000" w:type="dxa"/>
-          </w:tcPr>
-          <w:p>
-            <w:r>
+        <w:trPr>
+          <w:cantSplit w:val="0"/>
+        </w:trPr>
+        <w:tc>
+          <w:tcPr>
+            <w:tcW w:w="2200" w:type="dxa"/>
+            <w:shd w:fill="ffffff" w:val="clear"/>
+            <w:vAlign w:val="center"/>
+          </w:tcPr>
+          <w:p>
+            <w:pPr>
+              <w:spacing w:after="40" w:before="40" w:line="240" w:lineRule="auto"/>
+              <w:ind w:left="60" w:right="60" w:firstLine="0"/>
+              <w:jc w:val="left"/>
+              <w:rPr/>
+            </w:pPr>
+            <w:r>
+              <w:rPr>
+                <w:rFonts w:ascii="Open Sans" w:cs="Open Sans" w:eastAsia="Open Sans" w:hAnsi="Open Sans"/>
+                <w:sz w:val="18"/>
+                <w:szCs w:val="18"/>
+                <w:rtl w:val="0"/>
+              </w:rPr>
               <w:t xml:space="preserve">Unit</w:t>
             </w:r>
           </w:p>
         </w:tc>
         <w:tc>
           <w:tcPr>
-            <w:tcW w:w="7360" w:type="dxa"/>
-          </w:tcPr>
-          <w:p>
-            <w:r>
+            <w:tcW w:w="7160" w:type="dxa"/>
+            <w:shd w:fill="ffffff" w:val="clear"/>
+            <w:vAlign w:val="center"/>
+          </w:tcPr>
+          <w:p>
+            <w:pPr>
+              <w:spacing w:after="40" w:before="40" w:line="240" w:lineRule="auto"/>
+              <w:ind w:left="60" w:right="60" w:firstLine="0"/>
+              <w:jc w:val="left"/>
+              <w:rPr/>
+            </w:pPr>
+            <w:r>
+              <w:rPr>
+                <w:rFonts w:ascii="Open Sans" w:cs="Open Sans" w:eastAsia="Open Sans" w:hAnsi="Open Sans"/>
+                <w:sz w:val="18"/>
+                <w:szCs w:val="18"/>
+                <w:rtl w:val="0"/>
+              </w:rPr>
               <w:t xml:space="preserve">Una parte del sistema que se construye y se entrega por sí sola. Un Intent se descompone en Units; equivalen a los subdominios del diseño guiado por el dominio o a las épicas de Scrum.</w:t>
             </w:r>
           </w:p>
         </w:tc>
       </w:tr>
       <w:tr>
-        <w:tc>
-          <w:tcPr>
-            <w:tcW w:w="2000" w:type="dxa"/>
-          </w:tcPr>
-          <w:p>
-            <w:r>
+        <w:trPr>
+          <w:cantSplit w:val="0"/>
+        </w:trPr>
+        <w:tc>
+          <w:tcPr>
+            <w:tcW w:w="2200" w:type="dxa"/>
+            <w:shd w:fill="ffffff" w:val="clear"/>
+            <w:vAlign w:val="center"/>
+          </w:tcPr>
+          <w:p>
+            <w:pPr>
+              <w:spacing w:after="40" w:before="40" w:line="240" w:lineRule="auto"/>
+              <w:ind w:left="60" w:right="60" w:firstLine="0"/>
+              <w:jc w:val="left"/>
+              <w:rPr/>
+            </w:pPr>
+            <w:r>
+              <w:rPr>
+                <w:rFonts w:ascii="Open Sans" w:cs="Open Sans" w:eastAsia="Open Sans" w:hAnsi="Open Sans"/>
+                <w:sz w:val="18"/>
+                <w:szCs w:val="18"/>
+                <w:rtl w:val="0"/>
+              </w:rPr>
               <w:t xml:space="preserve">Bolt</w:t>
             </w:r>
           </w:p>
         </w:tc>
         <w:tc>
           <w:tcPr>
-            <w:tcW w:w="7360" w:type="dxa"/>
-          </w:tcPr>
-          <w:p>
-            <w:r>
+            <w:tcW w:w="7160" w:type="dxa"/>
+            <w:shd w:fill="ffffff" w:val="clear"/>
+            <w:vAlign w:val="center"/>
+          </w:tcPr>
+          <w:p>
+            <w:pPr>
+              <w:spacing w:after="40" w:before="40" w:line="240" w:lineRule="auto"/>
+              <w:ind w:left="60" w:right="60" w:firstLine="0"/>
+              <w:jc w:val="left"/>
+              <w:rPr/>
+            </w:pPr>
+            <w:r>
+              <w:rPr>
+                <w:rFonts w:ascii="Open Sans" w:cs="Open Sans" w:eastAsia="Open Sans" w:hAnsi="Open Sans"/>
+                <w:sz w:val="18"/>
+                <w:szCs w:val="18"/>
+                <w:rtl w:val="0"/>
+              </w:rPr>
               <w:t xml:space="preserve">El ciclo en que se construye un Unit. Es lo que en Scrum era el sprint, pero de horas o días en lugar de semanas. Un Unit puede necesitar varios Bolts.</w:t>
             </w:r>
           </w:p>
@@ -1106,34 +1836,71 @@
     <w:p>
       <w:pPr>
         <w:pStyle w:val="Heading2"/>
-      </w:pPr>
-      <w:r>
+        <w:spacing w:after="120" w:before="360" w:lineRule="auto"/>
+        <w:ind w:left="720" w:firstLine="0"/>
+        <w:jc w:val="left"/>
+        <w:rPr>
+          <w:sz w:val="28"/>
+          <w:szCs w:val="28"/>
+        </w:rPr>
+      </w:pPr>
+      <w:r>
+        <w:rPr>
+          <w:rFonts w:ascii="Open Sans SemiBold" w:cs="Open Sans SemiBold" w:eastAsia="Open Sans SemiBold" w:hAnsi="Open Sans SemiBold"/>
+          <w:color w:val="282d68"/>
+          <w:sz w:val="28"/>
+          <w:szCs w:val="28"/>
+          <w:rtl w:val="0"/>
+        </w:rPr>
         <w:t xml:space="preserve">Los que produce la construcción</w:t>
       </w:r>
     </w:p>
     <w:tbl>
       <w:tblPr>
-        <w:tblStyle w:val="Table3"/>
+        <w:tblStyle w:val="Table2"/>
         <w:tblW w:w="9360" w:type="dxa"/>
+        <w:jc w:val="left"/>
+        <w:tblInd w:w="720" w:type="dxa"/>
+        <w:tblBorders>
+          <w:top w:color="d9d9d9" w:space="0" w:sz="4" w:val="single"/>
+          <w:left w:color="d9d9d9" w:space="0" w:sz="4" w:val="single"/>
+          <w:bottom w:color="d9d9d9" w:space="0" w:sz="4" w:val="single"/>
+          <w:right w:color="d9d9d9" w:space="0" w:sz="4" w:val="single"/>
+          <w:insideH w:color="d9d9d9" w:space="0" w:sz="4" w:val="single"/>
+          <w:insideV w:color="d9d9d9" w:space="0" w:sz="4" w:val="single"/>
+        </w:tblBorders>
         <w:tblLayout w:type="fixed"/>
+        <w:tblLook w:val="0000"/>
       </w:tblPr>
       <w:tblGrid>
-        <w:gridCol w:w="2000"/>
-        <w:gridCol w:w="7360"/>
+        <w:gridCol w:w="2200"/>
+        <w:gridCol w:w="7160"/>
       </w:tblGrid>
       <w:tr>
         <w:trPr>
-          <w:tblHeader/>
+          <w:cantSplit w:val="0"/>
+          <w:tblHeader w:val="1"/>
         </w:trPr>
         <w:tc>
           <w:tcPr>
-            <w:tcW w:w="2000" w:type="dxa"/>
-          </w:tcPr>
-          <w:p>
-            <w:r>
-              <w:rPr>
-                <w:b w:val="1"/>
-                <w:bCs w:val="1"/>
+            <w:tcW w:w="2200" w:type="dxa"/>
+            <w:shd w:fill="282d68" w:val="clear"/>
+            <w:vAlign w:val="center"/>
+          </w:tcPr>
+          <w:p>
+            <w:pPr>
+              <w:spacing w:after="40" w:before="40" w:line="240" w:lineRule="auto"/>
+              <w:ind w:left="60" w:right="60" w:firstLine="0"/>
+              <w:jc w:val="left"/>
+              <w:rPr/>
+            </w:pPr>
+            <w:r>
+              <w:rPr>
+                <w:rFonts w:ascii="Open Sans SemiBold" w:cs="Open Sans SemiBold" w:eastAsia="Open Sans SemiBold" w:hAnsi="Open Sans SemiBold"/>
+                <w:color w:val="ffffff"/>
+                <w:sz w:val="18"/>
+                <w:szCs w:val="18"/>
+                <w:rtl w:val="0"/>
               </w:rPr>
               <w:t xml:space="preserve">Artefacto</w:t>
             </w:r>
@@ -1141,13 +1908,24 @@
         </w:tc>
         <w:tc>
           <w:tcPr>
-            <w:tcW w:w="7360" w:type="dxa"/>
-          </w:tcPr>
-          <w:p>
-            <w:r>
-              <w:rPr>
-                <w:b w:val="1"/>
-                <w:bCs w:val="1"/>
+            <w:tcW w:w="7160" w:type="dxa"/>
+            <w:shd w:fill="282d68" w:val="clear"/>
+            <w:vAlign w:val="center"/>
+          </w:tcPr>
+          <w:p>
+            <w:pPr>
+              <w:spacing w:after="40" w:before="40" w:line="240" w:lineRule="auto"/>
+              <w:ind w:left="60" w:right="60" w:firstLine="0"/>
+              <w:jc w:val="left"/>
+              <w:rPr/>
+            </w:pPr>
+            <w:r>
+              <w:rPr>
+                <w:rFonts w:ascii="Open Sans SemiBold" w:cs="Open Sans SemiBold" w:eastAsia="Open Sans SemiBold" w:hAnsi="Open Sans SemiBold"/>
+                <w:color w:val="ffffff"/>
+                <w:sz w:val="18"/>
+                <w:szCs w:val="18"/>
+                <w:rtl w:val="0"/>
               </w:rPr>
               <w:t xml:space="preserve">Qué es</w:t>
             </w:r>
@@ -1155,66 +1933,159 @@
         </w:tc>
       </w:tr>
       <w:tr>
-        <w:tc>
-          <w:tcPr>
-            <w:tcW w:w="2000" w:type="dxa"/>
-          </w:tcPr>
-          <w:p>
-            <w:r>
+        <w:trPr>
+          <w:cantSplit w:val="0"/>
+        </w:trPr>
+        <w:tc>
+          <w:tcPr>
+            <w:tcW w:w="2200" w:type="dxa"/>
+            <w:shd w:fill="ffffff" w:val="clear"/>
+            <w:vAlign w:val="center"/>
+          </w:tcPr>
+          <w:p>
+            <w:pPr>
+              <w:spacing w:after="40" w:before="40" w:line="240" w:lineRule="auto"/>
+              <w:ind w:left="60" w:right="60" w:firstLine="0"/>
+              <w:jc w:val="left"/>
+              <w:rPr/>
+            </w:pPr>
+            <w:r>
+              <w:rPr>
+                <w:rFonts w:ascii="Open Sans" w:cs="Open Sans" w:eastAsia="Open Sans" w:hAnsi="Open Sans"/>
+                <w:sz w:val="18"/>
+                <w:szCs w:val="18"/>
+                <w:rtl w:val="0"/>
+              </w:rPr>
               <w:t xml:space="preserve">Domain Design</w:t>
             </w:r>
           </w:p>
         </w:tc>
         <w:tc>
           <w:tcPr>
-            <w:tcW w:w="7360" w:type="dxa"/>
-          </w:tcPr>
-          <w:p>
-            <w:r>
+            <w:tcW w:w="7160" w:type="dxa"/>
+            <w:shd w:fill="ffffff" w:val="clear"/>
+            <w:vAlign w:val="center"/>
+          </w:tcPr>
+          <w:p>
+            <w:pPr>
+              <w:spacing w:after="40" w:before="40" w:line="240" w:lineRule="auto"/>
+              <w:ind w:left="60" w:right="60" w:firstLine="0"/>
+              <w:jc w:val="left"/>
+              <w:rPr/>
+            </w:pPr>
+            <w:r>
+              <w:rPr>
+                <w:rFonts w:ascii="Open Sans" w:cs="Open Sans" w:eastAsia="Open Sans" w:hAnsi="Open Sans"/>
+                <w:sz w:val="18"/>
+                <w:szCs w:val="18"/>
+                <w:rtl w:val="0"/>
+              </w:rPr>
               <w:t xml:space="preserve">La lógica de negocio de un Unit, sin decidir todavía la tecnología. La IA modela con diseño guiado por el dominio: agregados, entidades, objetos de valor, eventos, repositorios.</w:t>
             </w:r>
           </w:p>
         </w:tc>
       </w:tr>
       <w:tr>
-        <w:tc>
-          <w:tcPr>
-            <w:tcW w:w="2000" w:type="dxa"/>
-          </w:tcPr>
-          <w:p>
-            <w:r>
+        <w:trPr>
+          <w:cantSplit w:val="0"/>
+        </w:trPr>
+        <w:tc>
+          <w:tcPr>
+            <w:tcW w:w="2200" w:type="dxa"/>
+            <w:shd w:fill="ffffff" w:val="clear"/>
+            <w:vAlign w:val="center"/>
+          </w:tcPr>
+          <w:p>
+            <w:pPr>
+              <w:spacing w:after="40" w:before="40" w:line="240" w:lineRule="auto"/>
+              <w:ind w:left="60" w:right="60" w:firstLine="0"/>
+              <w:jc w:val="left"/>
+              <w:rPr/>
+            </w:pPr>
+            <w:r>
+              <w:rPr>
+                <w:rFonts w:ascii="Open Sans" w:cs="Open Sans" w:eastAsia="Open Sans" w:hAnsi="Open Sans"/>
+                <w:sz w:val="18"/>
+                <w:szCs w:val="18"/>
+                <w:rtl w:val="0"/>
+              </w:rPr>
               <w:t xml:space="preserve">Logical Design</w:t>
             </w:r>
           </w:p>
         </w:tc>
         <w:tc>
           <w:tcPr>
-            <w:tcW w:w="7360" w:type="dxa"/>
-          </w:tcPr>
-          <w:p>
-            <w:r>
+            <w:tcW w:w="7160" w:type="dxa"/>
+            <w:shd w:fill="ffffff" w:val="clear"/>
+            <w:vAlign w:val="center"/>
+          </w:tcPr>
+          <w:p>
+            <w:pPr>
+              <w:spacing w:after="40" w:before="40" w:line="240" w:lineRule="auto"/>
+              <w:ind w:left="60" w:right="60" w:firstLine="0"/>
+              <w:jc w:val="left"/>
+              <w:rPr/>
+            </w:pPr>
+            <w:r>
+              <w:rPr>
+                <w:rFonts w:ascii="Open Sans" w:cs="Open Sans" w:eastAsia="Open Sans" w:hAnsi="Open Sans"/>
+                <w:sz w:val="18"/>
+                <w:szCs w:val="18"/>
+                <w:rtl w:val="0"/>
+              </w:rPr>
               <w:t xml:space="preserve">El mismo diseño, ya resuelto para los requisitos no funcionales y con los patrones de arquitectura que correspondan. Cada decisión queda registrada en un ADR que una persona valida.</w:t>
             </w:r>
           </w:p>
         </w:tc>
       </w:tr>
       <w:tr>
-        <w:tc>
-          <w:tcPr>
-            <w:tcW w:w="2000" w:type="dxa"/>
-          </w:tcPr>
-          <w:p>
-            <w:r>
+        <w:trPr>
+          <w:cantSplit w:val="0"/>
+        </w:trPr>
+        <w:tc>
+          <w:tcPr>
+            <w:tcW w:w="2200" w:type="dxa"/>
+            <w:shd w:fill="ffffff" w:val="clear"/>
+            <w:vAlign w:val="center"/>
+          </w:tcPr>
+          <w:p>
+            <w:pPr>
+              <w:spacing w:after="40" w:before="40" w:line="240" w:lineRule="auto"/>
+              <w:ind w:left="60" w:right="60" w:firstLine="0"/>
+              <w:jc w:val="left"/>
+              <w:rPr/>
+            </w:pPr>
+            <w:r>
+              <w:rPr>
+                <w:rFonts w:ascii="Open Sans" w:cs="Open Sans" w:eastAsia="Open Sans" w:hAnsi="Open Sans"/>
+                <w:sz w:val="18"/>
+                <w:szCs w:val="18"/>
+                <w:rtl w:val="0"/>
+              </w:rPr>
               <w:t xml:space="preserve">Deployment Units</w:t>
             </w:r>
           </w:p>
         </w:tc>
         <w:tc>
           <w:tcPr>
-            <w:tcW w:w="7360" w:type="dxa"/>
-          </w:tcPr>
-          <w:p>
-            <w:r>
+            <w:tcW w:w="7160" w:type="dxa"/>
+            <w:shd w:fill="ffffff" w:val="clear"/>
+            <w:vAlign w:val="center"/>
+          </w:tcPr>
+          <w:p>
+            <w:pPr>
+              <w:spacing w:after="40" w:before="40" w:line="240" w:lineRule="auto"/>
+              <w:ind w:left="60" w:right="60" w:firstLine="0"/>
+              <w:jc w:val="left"/>
+              <w:rPr/>
+            </w:pPr>
+            <w:r>
+              <w:rPr>
+                <w:rFonts w:ascii="Open Sans" w:cs="Open Sans" w:eastAsia="Open Sans" w:hAnsi="Open Sans"/>
+                <w:sz w:val="18"/>
+                <w:szCs w:val="18"/>
+                <w:rtl w:val="0"/>
+              </w:rPr>
               <w:t xml:space="preserve">El paquete listo para desplegar: el código ejecutable, su configuración y su infraestructura.</w:t>
             </w:r>
           </w:p>
@@ -1222,191 +2093,572 @@
       </w:tr>
     </w:tbl>
     <w:p>
-      <w:r>
+      <w:pPr>
+        <w:spacing w:after="0" w:before="0"/>
+        <w:ind w:left="720" w:firstLine="0"/>
+        <w:rPr/>
+      </w:pPr>
+    </w:p>
+    <w:p>
+      <w:pPr>
+        <w:spacing w:after="200" w:before="0" w:lineRule="auto"/>
+        <w:ind w:left="720" w:firstLine="0"/>
+        <w:jc w:val="both"/>
+        <w:rPr/>
+      </w:pPr>
+      <w:r>
+        <w:rPr>
+          <w:rFonts w:ascii="Open Sans" w:cs="Open Sans" w:eastAsia="Open Sans" w:hAnsi="Open Sans"/>
+          <w:sz w:val="21"/>
+          <w:szCs w:val="21"/>
+          <w:rtl w:val="0"/>
+        </w:rPr>
         <w:t xml:space="preserve">Un requisito no funcional describe qué tan bien hace el sistema lo que hace: cuánto tarda, cuánto aguanta, qué registra, qué protege.</w:t>
       </w:r>
     </w:p>
     <w:p>
-      <w:r>
+      <w:pPr>
+        <w:spacing w:after="200" w:before="0" w:lineRule="auto"/>
+        <w:ind w:left="720" w:firstLine="0"/>
+        <w:jc w:val="both"/>
+        <w:rPr/>
+      </w:pPr>
+      <w:r>
+        <w:rPr>
+          <w:rFonts w:ascii="Open Sans" w:cs="Open Sans" w:eastAsia="Open Sans" w:hAnsi="Open Sans"/>
+          <w:sz w:val="21"/>
+          <w:szCs w:val="21"/>
+          <w:rtl w:val="0"/>
+        </w:rPr>
         <w:t xml:space="preserve">Ninguno de los seis se descarta al cerrar la fase. Todos quedan guardados y la IA los usa como memoria de contexto durante el resto del ciclo: el diseño recuerda lo que se decidió en los requisitos, y el despliegue recuerda lo que se decidió en el diseño.</w:t>
       </w:r>
     </w:p>
     <w:p>
       <w:pPr>
         <w:pStyle w:val="Heading1"/>
+        <w:spacing w:after="120" w:before="240" w:line="240" w:lineRule="auto"/>
+        <w:ind w:left="720" w:firstLine="0"/>
+        <w:jc w:val="left"/>
+        <w:rPr>
+          <w:color w:val="0084d5"/>
+        </w:rPr>
       </w:pPr>
       <w:r>
         <w:br w:type="page"/>
       </w:r>
       <w:r>
+        <w:rPr>
+          <w:rFonts w:ascii="Poppins" w:cs="Poppins" w:eastAsia="Poppins" w:hAnsi="Poppins"/>
+          <w:b w:val="1"/>
+          <w:bCs w:val="1"/>
+          <w:color w:val="0084d5"/>
+          <w:sz w:val="42"/>
+          <w:szCs w:val="42"/>
+          <w:rtl w:val="0"/>
+        </w:rPr>
         <w:t xml:space="preserve">4. FASES Y RITUALES</w:t>
       </w:r>
     </w:p>
     <w:p>
-      <w:r>
+      <w:pPr>
+        <w:spacing w:after="200" w:before="0" w:lineRule="auto"/>
+        <w:ind w:left="720" w:firstLine="0"/>
+        <w:jc w:val="both"/>
+        <w:rPr/>
+      </w:pPr>
+      <w:r>
+        <w:rPr>
+          <w:rFonts w:ascii="Open Sans" w:cs="Open Sans" w:eastAsia="Open Sans" w:hAnsi="Open Sans"/>
+          <w:sz w:val="21"/>
+          <w:szCs w:val="21"/>
+          <w:rtl w:val="0"/>
+        </w:rPr>
         <w:t xml:space="preserve">La metodología ordena el trabajo en tres fases y define cómo trabaja el equipo dentro de cada una. Los rituales son esas sesiones de trabajo: el equipo revisa en vivo lo que la IA propuso y decide sobre la marcha.</w:t>
       </w:r>
     </w:p>
     <w:p>
       <w:pPr>
-        <w:spacing w:before="240" w:after="240"/>
+        <w:spacing w:after="80" w:before="240" w:lineRule="auto"/>
+        <w:ind w:left="720" w:firstLine="0"/>
         <w:jc w:val="center"/>
-      </w:pPr>
-      <w:r>
-        <w:rPr>
+        <w:rPr/>
+      </w:pPr>
+      <w:r>
+        <w:rPr>
+          <w:rtl w:val="0"/>
+        </w:rPr>
+        <w:drawing>
+          <wp:inline distB="0" distT="0" distL="0" distR="0">
+            <wp:extent cx="4937760" cy="4018149"/>
+            <wp:effectExtent b="0" l="0" r="0" t="0"/>
+            <wp:docPr id="8727" name="figura3.png"/>
+            <a:graphic>
+              <a:graphicData uri="http://schemas.openxmlformats.org/drawingml/2006/picture">
+                <pic:pic>
+                  <pic:nvPicPr>
+                    <pic:cNvPr id="0" name="figura3.png"/>
+                    <pic:cNvPicPr preferRelativeResize="0"/>
+                  </pic:nvPicPr>
+                  <pic:blipFill>
+                    <a:blip r:embed="rId17"/>
+                    <a:srcRect b="0" l="0" r="0" t="0"/>
+                    <a:stretch>
+                      <a:fillRect/>
+                    </a:stretch>
+                  </pic:blipFill>
+                  <pic:spPr>
+                    <a:xfrm>
+                      <a:off x="0" y="0"/>
+                      <a:ext cx="4937760" cy="4018149"/>
+                    </a:xfrm>
+                    <a:prstGeom prst="rect">
+                      <a:avLst/>
+                    </a:prstGeom>
+                  </pic:spPr>
+                </pic:pic>
+              </a:graphicData>
+            </a:graphic>
+          </wp:inline>
+        </w:drawing>
+      </w:r>
+    </w:p>
+    <w:p>
+      <w:pPr>
+        <w:spacing w:after="240" w:before="0" w:lineRule="auto"/>
+        <w:ind w:left="720" w:firstLine="0"/>
+        <w:jc w:val="center"/>
+        <w:rPr/>
+      </w:pPr>
+      <w:r>
+        <w:rPr>
+          <w:rFonts w:ascii="Open Sans" w:cs="Open Sans" w:eastAsia="Open Sans" w:hAnsi="Open Sans"/>
           <w:i w:val="1"/>
           <w:iCs w:val="1"/>
           <w:color w:val="666666"/>
-        </w:rPr>
-        <w:t xml:space="preserve">[Figura 3 — El ciclo completo]</w:t>
+          <w:sz w:val="18"/>
+          <w:szCs w:val="18"/>
+          <w:rtl w:val="0"/>
+        </w:rPr>
+        <w:t xml:space="preserve">Figura 2. El ciclo completo: roles, fases y artefactos.</w:t>
       </w:r>
     </w:p>
     <w:p>
       <w:pPr>
         <w:pStyle w:val="Heading3"/>
-      </w:pPr>
-      <w:r>
+        <w:spacing w:after="80" w:before="280" w:lineRule="auto"/>
+        <w:ind w:left="720" w:firstLine="0"/>
+        <w:jc w:val="left"/>
+        <w:rPr/>
+      </w:pPr>
+      <w:r>
+        <w:rPr>
+          <w:rFonts w:ascii="Open Sans SemiBold" w:cs="Open Sans SemiBold" w:eastAsia="Open Sans SemiBold" w:hAnsi="Open Sans SemiBold"/>
+          <w:color w:val="0084d5"/>
+          <w:sz w:val="22"/>
+          <w:szCs w:val="22"/>
+          <w:rtl w:val="0"/>
+        </w:rPr>
         <w:t xml:space="preserve">Inception: qué construir y por qué</w:t>
       </w:r>
     </w:p>
     <w:p>
-      <w:r>
+      <w:pPr>
+        <w:spacing w:after="200" w:before="0" w:lineRule="auto"/>
+        <w:ind w:left="720" w:firstLine="0"/>
+        <w:jc w:val="both"/>
+        <w:rPr/>
+      </w:pPr>
+      <w:r>
+        <w:rPr>
+          <w:rFonts w:ascii="Open Sans" w:cs="Open Sans" w:eastAsia="Open Sans" w:hAnsi="Open Sans"/>
+          <w:sz w:val="21"/>
+          <w:szCs w:val="21"/>
+          <w:rtl w:val="0"/>
+        </w:rPr>
         <w:t xml:space="preserve">La IA propone las historias de usuario, los criterios de aceptación, los requisitos no funcionales, los riesgos y la descomposición del Intent en Units. El equipo revisa esa propuesta en vivo y corrige lo que está sobre-diseñado o lo que quedó corto. Ese ritual es la Mob Elaboration, y en él participan el Product Owner, los desarrolladores y la IA. La fase cierra con los Units aprobados y los Bolts sugeridos para construirlos.</w:t>
       </w:r>
     </w:p>
     <w:p>
       <w:pPr>
         <w:pStyle w:val="Heading3"/>
-      </w:pPr>
-      <w:r>
+        <w:spacing w:after="80" w:before="280" w:lineRule="auto"/>
+        <w:ind w:left="720" w:firstLine="0"/>
+        <w:jc w:val="left"/>
+        <w:rPr/>
+      </w:pPr>
+      <w:r>
+        <w:rPr>
+          <w:rFonts w:ascii="Open Sans SemiBold" w:cs="Open Sans SemiBold" w:eastAsia="Open Sans SemiBold" w:hAnsi="Open Sans SemiBold"/>
+          <w:color w:val="0084d5"/>
+          <w:sz w:val="22"/>
+          <w:szCs w:val="22"/>
+          <w:rtl w:val="0"/>
+        </w:rPr>
         <w:t xml:space="preserve">Construction: cómo construirlo</w:t>
       </w:r>
     </w:p>
     <w:p>
-      <w:r>
+      <w:pPr>
+        <w:spacing w:after="200" w:before="0" w:lineRule="auto"/>
+        <w:ind w:left="720" w:firstLine="0"/>
+        <w:jc w:val="both"/>
+        <w:rPr/>
+      </w:pPr>
+      <w:r>
+        <w:rPr>
+          <w:rFonts w:ascii="Open Sans" w:cs="Open Sans" w:eastAsia="Open Sans" w:hAnsi="Open Sans"/>
+          <w:sz w:val="21"/>
+          <w:szCs w:val="21"/>
+          <w:rtl w:val="0"/>
+        </w:rPr>
         <w:t xml:space="preserve">Cada Unit se construye en uno o más Bolts. La IA modela el dominio, resuelve los requisitos no funcionales y genera el código con sus pruebas. Los equipos intercambian las especificaciones de integración y deciden los patrones de arquitectura: es la Mob Construction. Para validar el resultado contra lo que se pidió, el Product Owner vuelve a la mesa en la Mob Testing. La fase cierra con Deployment Units probados.</w:t>
       </w:r>
     </w:p>
     <w:p>
       <w:pPr>
         <w:pStyle w:val="Heading3"/>
-      </w:pPr>
-      <w:r>
+        <w:spacing w:after="80" w:before="280" w:lineRule="auto"/>
+        <w:ind w:left="720" w:firstLine="0"/>
+        <w:jc w:val="left"/>
+        <w:rPr/>
+      </w:pPr>
+      <w:r>
+        <w:rPr>
+          <w:rFonts w:ascii="Open Sans SemiBold" w:cs="Open Sans SemiBold" w:eastAsia="Open Sans SemiBold" w:hAnsi="Open Sans SemiBold"/>
+          <w:color w:val="0084d5"/>
+          <w:sz w:val="22"/>
+          <w:szCs w:val="22"/>
+          <w:rtl w:val="0"/>
+        </w:rPr>
         <w:t xml:space="preserve">Operations: mantenerlo vivo</w:t>
       </w:r>
     </w:p>
     <w:p>
-      <w:r>
+      <w:pPr>
+        <w:spacing w:after="200" w:before="0" w:lineRule="auto"/>
+        <w:ind w:left="720" w:firstLine="0"/>
+        <w:jc w:val="both"/>
+        <w:rPr/>
+      </w:pPr>
+      <w:r>
+        <w:rPr>
+          <w:rFonts w:ascii="Open Sans" w:cs="Open Sans" w:eastAsia="Open Sans" w:hAnsi="Open Sans"/>
+          <w:sz w:val="21"/>
+          <w:szCs w:val="21"/>
+          <w:rtl w:val="0"/>
+        </w:rPr>
         <w:t xml:space="preserve">Despliegue, observabilidad e incidentes, con la IA analizando métricas, registros y trazas para anticipar anomalías. No tiene un ritual propio.</w:t>
       </w:r>
     </w:p>
     <w:p>
       <w:pPr>
         <w:pStyle w:val="Heading3"/>
-      </w:pPr>
-      <w:r>
+        <w:spacing w:after="80" w:before="280" w:lineRule="auto"/>
+        <w:ind w:left="720" w:firstLine="0"/>
+        <w:jc w:val="left"/>
+        <w:rPr/>
+      </w:pPr>
+      <w:r>
+        <w:rPr>
+          <w:rFonts w:ascii="Open Sans SemiBold" w:cs="Open Sans SemiBold" w:eastAsia="Open Sans SemiBold" w:hAnsi="Open Sans SemiBold"/>
+          <w:color w:val="0084d5"/>
+          <w:sz w:val="22"/>
+          <w:szCs w:val="22"/>
+          <w:rtl w:val="0"/>
+        </w:rPr>
         <w:t xml:space="preserve">Los puntos de validación</w:t>
       </w:r>
     </w:p>
     <w:p>
-      <w:r>
+      <w:pPr>
+        <w:spacing w:after="200" w:before="0" w:lineRule="auto"/>
+        <w:ind w:left="720" w:firstLine="0"/>
+        <w:jc w:val="both"/>
+        <w:rPr/>
+      </w:pPr>
+      <w:r>
+        <w:rPr>
+          <w:rFonts w:ascii="Open Sans" w:cs="Open Sans" w:eastAsia="Open Sans" w:hAnsi="Open Sans"/>
+          <w:sz w:val="21"/>
+          <w:szCs w:val="21"/>
+          <w:rtl w:val="0"/>
+        </w:rPr>
         <w:t xml:space="preserve">Ninguna fase avanza sola. En cada paso la IA presenta su propuesta y espera; el trabajo continúa cuando una persona la aprueba.</w:t>
       </w:r>
     </w:p>
     <w:p>
       <w:pPr>
         <w:pStyle w:val="Heading1"/>
+        <w:spacing w:after="120" w:before="240" w:line="240" w:lineRule="auto"/>
+        <w:ind w:left="720" w:firstLine="0"/>
+        <w:jc w:val="left"/>
+        <w:rPr>
+          <w:color w:val="0084d5"/>
+        </w:rPr>
       </w:pPr>
       <w:r>
         <w:br w:type="page"/>
       </w:r>
       <w:r>
+        <w:rPr>
+          <w:rFonts w:ascii="Poppins" w:cs="Poppins" w:eastAsia="Poppins" w:hAnsi="Poppins"/>
+          <w:b w:val="1"/>
+          <w:bCs w:val="1"/>
+          <w:color w:val="0084d5"/>
+          <w:sz w:val="42"/>
+          <w:szCs w:val="42"/>
+          <w:rtl w:val="0"/>
+        </w:rPr>
         <w:t xml:space="preserve">5. EL FLUJO</w:t>
       </w:r>
     </w:p>
     <w:p>
-      <w:r>
+      <w:pPr>
+        <w:spacing w:after="200" w:before="0" w:lineRule="auto"/>
+        <w:ind w:left="720" w:firstLine="0"/>
+        <w:jc w:val="both"/>
+        <w:rPr/>
+      </w:pPr>
+      <w:r>
+        <w:rPr>
+          <w:rFonts w:ascii="Open Sans" w:cs="Open Sans" w:eastAsia="Open Sans" w:hAnsi="Open Sans"/>
+          <w:sz w:val="21"/>
+          <w:szCs w:val="21"/>
+          <w:rtl w:val="0"/>
+        </w:rPr>
         <w:t xml:space="preserve">El ciclo se recorre en nueve pasos, del Intent al sistema en producción.</w:t>
       </w:r>
     </w:p>
     <w:p>
       <w:pPr>
-        <w:spacing w:before="240" w:after="240"/>
+        <w:spacing w:after="80" w:before="240" w:lineRule="auto"/>
+        <w:ind w:left="720" w:firstLine="0"/>
         <w:jc w:val="center"/>
-      </w:pPr>
-      <w:r>
-        <w:rPr>
+        <w:rPr/>
+      </w:pPr>
+      <w:r>
+        <w:rPr>
+          <w:rtl w:val="0"/>
+        </w:rPr>
+        <w:drawing>
+          <wp:inline distB="0" distT="0" distL="0" distR="0">
+            <wp:extent cx="5120640" cy="4210304"/>
+            <wp:effectExtent b="0" l="0" r="0" t="0"/>
+            <wp:docPr id="4834" name="figura2.png"/>
+            <a:graphic>
+              <a:graphicData uri="http://schemas.openxmlformats.org/drawingml/2006/picture">
+                <pic:pic>
+                  <pic:nvPicPr>
+                    <pic:cNvPr id="0" name="figura2.png"/>
+                    <pic:cNvPicPr preferRelativeResize="0"/>
+                  </pic:nvPicPr>
+                  <pic:blipFill>
+                    <a:blip r:embed="rId16"/>
+                    <a:srcRect b="0" l="0" r="0" t="0"/>
+                    <a:stretch>
+                      <a:fillRect/>
+                    </a:stretch>
+                  </pic:blipFill>
+                  <pic:spPr>
+                    <a:xfrm>
+                      <a:off x="0" y="0"/>
+                      <a:ext cx="5120640" cy="4210304"/>
+                    </a:xfrm>
+                    <a:prstGeom prst="rect">
+                      <a:avLst/>
+                    </a:prstGeom>
+                  </pic:spPr>
+                </pic:pic>
+              </a:graphicData>
+            </a:graphic>
+          </wp:inline>
+        </w:drawing>
+      </w:r>
+    </w:p>
+    <w:p>
+      <w:pPr>
+        <w:spacing w:after="240" w:before="0" w:lineRule="auto"/>
+        <w:ind w:left="720" w:firstLine="0"/>
+        <w:jc w:val="center"/>
+        <w:rPr/>
+      </w:pPr>
+      <w:r>
+        <w:rPr>
+          <w:rFonts w:ascii="Open Sans" w:cs="Open Sans" w:eastAsia="Open Sans" w:hAnsi="Open Sans"/>
           <w:i w:val="1"/>
           <w:iCs w:val="1"/>
           <w:color w:val="666666"/>
-        </w:rPr>
-        <w:t xml:space="preserve">[Figura 2 — El flujo: nueve pasos, tres fases]</w:t>
-      </w:r>
-    </w:p>
-    <w:p>
-      <w:r>
+          <w:sz w:val="18"/>
+          <w:szCs w:val="18"/>
+          <w:rtl w:val="0"/>
+        </w:rPr>
+        <w:t xml:space="preserve">Figura 3. Los nueve pasos, agrupados en las tres fases.</w:t>
+      </w:r>
+    </w:p>
+    <w:p>
+      <w:pPr>
+        <w:spacing w:after="200" w:before="0" w:lineRule="auto"/>
+        <w:ind w:left="720" w:firstLine="0"/>
+        <w:jc w:val="both"/>
+        <w:rPr/>
+      </w:pPr>
+      <w:r>
+        <w:rPr>
+          <w:rFonts w:ascii="Open Sans" w:cs="Open Sans" w:eastAsia="Open Sans" w:hAnsi="Open Sans"/>
+          <w:sz w:val="21"/>
+          <w:szCs w:val="21"/>
+          <w:rtl w:val="0"/>
+        </w:rPr>
         <w:t xml:space="preserve">El recorrido empieza con un plan. La IA lee la intención de negocio y propone los pasos necesarios para llevarla a cabo; el equipo lo revisa, lo corrige y lo aprueba. Después la IA descompone cada paso en tareas más finas, bajo la misma revisión. Cada paso deja artefactos que el siguiente usa como contexto, y por eso el orden importa.</w:t>
       </w:r>
     </w:p>
     <w:p>
       <w:pPr>
         <w:pStyle w:val="Heading2"/>
-      </w:pPr>
-      <w:r>
+        <w:spacing w:after="120" w:before="360" w:lineRule="auto"/>
+        <w:ind w:left="720" w:firstLine="0"/>
+        <w:jc w:val="left"/>
+        <w:rPr>
+          <w:sz w:val="28"/>
+          <w:szCs w:val="28"/>
+        </w:rPr>
+      </w:pPr>
+      <w:r>
+        <w:rPr>
+          <w:rFonts w:ascii="Open Sans SemiBold" w:cs="Open Sans SemiBold" w:eastAsia="Open Sans SemiBold" w:hAnsi="Open Sans SemiBold"/>
+          <w:color w:val="282d68"/>
+          <w:sz w:val="28"/>
+          <w:szCs w:val="28"/>
+          <w:rtl w:val="0"/>
+        </w:rPr>
         <w:t xml:space="preserve">Sistema nuevo y sistema existente</w:t>
       </w:r>
     </w:p>
     <w:p>
-      <w:r>
+      <w:pPr>
+        <w:spacing w:after="200" w:before="0" w:lineRule="auto"/>
+        <w:ind w:left="720" w:firstLine="0"/>
+        <w:jc w:val="both"/>
+        <w:rPr/>
+      </w:pPr>
+      <w:r>
+        <w:rPr>
+          <w:rFonts w:ascii="Open Sans" w:cs="Open Sans" w:eastAsia="Open Sans" w:hAnsi="Open Sans"/>
+          <w:sz w:val="21"/>
+          <w:szCs w:val="21"/>
+          <w:rtl w:val="0"/>
+        </w:rPr>
         <w:t xml:space="preserve">Los nueve pasos son los mismos en los dos casos. La diferencia está al principio de Construction: cuando el sistema ya existe, antes de modelar el dominio hay que elevar el código a un modelo.</w:t>
       </w:r>
     </w:p>
     <w:p>
-      <w:r>
+      <w:pPr>
+        <w:spacing w:after="200" w:before="0" w:lineRule="auto"/>
+        <w:ind w:left="720" w:firstLine="0"/>
+        <w:jc w:val="both"/>
+        <w:rPr/>
+      </w:pPr>
+      <w:r>
+        <w:rPr>
+          <w:rFonts w:ascii="Open Sans" w:cs="Open Sans" w:eastAsia="Open Sans" w:hAnsi="Open Sans"/>
+          <w:sz w:val="21"/>
+          <w:szCs w:val="21"/>
+          <w:rtl w:val="0"/>
+        </w:rPr>
         <w:t xml:space="preserve">La IA lee el código y produce dos representaciones. El modelo estático muestra los componentes del dominio, sus responsabilidades y sus relaciones. El modelo dinámico muestra cómo esos componentes interactúan para resolver los casos de uso principales. Los desarrolladores y el Product Owner revisan y corrigen ambos modelos antes de continuar; con eso resuelto, el resto del recorrido es igual al de un sistema nuevo.</w:t>
       </w:r>
     </w:p>
     <w:p>
       <w:pPr>
         <w:pStyle w:val="Heading1"/>
+        <w:spacing w:after="120" w:before="240" w:line="240" w:lineRule="auto"/>
+        <w:ind w:left="720" w:firstLine="0"/>
+        <w:jc w:val="left"/>
+        <w:rPr>
+          <w:color w:val="0084d5"/>
+        </w:rPr>
       </w:pPr>
       <w:r>
         <w:br w:type="page"/>
       </w:r>
       <w:r>
+        <w:rPr>
+          <w:rFonts w:ascii="Poppins" w:cs="Poppins" w:eastAsia="Poppins" w:hAnsi="Poppins"/>
+          <w:b w:val="1"/>
+          <w:bCs w:val="1"/>
+          <w:color w:val="0084d5"/>
+          <w:sz w:val="42"/>
+          <w:szCs w:val="42"/>
+          <w:rtl w:val="0"/>
+        </w:rPr>
         <w:t xml:space="preserve">6. HERRAMIENTAS Y SKILLS</w:t>
       </w:r>
     </w:p>
     <w:p>
-      <w:r>
+      <w:pPr>
+        <w:spacing w:after="200" w:before="0" w:lineRule="auto"/>
+        <w:ind w:left="720" w:firstLine="0"/>
+        <w:jc w:val="both"/>
+        <w:rPr/>
+      </w:pPr>
+      <w:r>
+        <w:rPr>
+          <w:rFonts w:ascii="Open Sans" w:cs="Open Sans" w:eastAsia="Open Sans" w:hAnsi="Open Sans"/>
+          <w:sz w:val="21"/>
+          <w:szCs w:val="21"/>
+          <w:rtl w:val="0"/>
+        </w:rPr>
         <w:t xml:space="preserve">El método no depende de una plataforma. Define qué capacidad hace falta en cada fase; cada proyecto la cubre con la herramienta que tenga.</w:t>
       </w:r>
     </w:p>
     <w:tbl>
       <w:tblPr>
-        <w:tblStyle w:val="Table3"/>
+        <w:tblStyle w:val="Table2"/>
         <w:tblW w:w="9360" w:type="dxa"/>
+        <w:jc w:val="left"/>
+        <w:tblInd w:w="720" w:type="dxa"/>
+        <w:tblBorders>
+          <w:top w:color="d9d9d9" w:space="0" w:sz="4" w:val="single"/>
+          <w:left w:color="d9d9d9" w:space="0" w:sz="4" w:val="single"/>
+          <w:bottom w:color="d9d9d9" w:space="0" w:sz="4" w:val="single"/>
+          <w:right w:color="d9d9d9" w:space="0" w:sz="4" w:val="single"/>
+          <w:insideH w:color="d9d9d9" w:space="0" w:sz="4" w:val="single"/>
+          <w:insideV w:color="d9d9d9" w:space="0" w:sz="4" w:val="single"/>
+        </w:tblBorders>
         <w:tblLayout w:type="fixed"/>
+        <w:tblLook w:val="0000"/>
       </w:tblPr>
       <w:tblGrid>
-        <w:gridCol w:w="1500"/>
-        <w:gridCol w:w="3200"/>
-        <w:gridCol w:w="3260"/>
+        <w:gridCol w:w="1400"/>
+        <w:gridCol w:w="3100"/>
+        <w:gridCol w:w="3460"/>
         <w:gridCol w:w="1400"/>
       </w:tblGrid>
       <w:tr>
         <w:trPr>
-          <w:tblHeader/>
+          <w:cantSplit w:val="0"/>
+          <w:tblHeader w:val="1"/>
         </w:trPr>
         <w:tc>
           <w:tcPr>
-            <w:tcW w:w="1500" w:type="dxa"/>
-          </w:tcPr>
-          <w:p>
-            <w:r>
-              <w:rPr>
-                <w:b w:val="1"/>
-                <w:bCs w:val="1"/>
+            <w:tcW w:w="1400" w:type="dxa"/>
+            <w:shd w:fill="282d68" w:val="clear"/>
+            <w:vAlign w:val="center"/>
+          </w:tcPr>
+          <w:p>
+            <w:pPr>
+              <w:spacing w:after="40" w:before="40" w:line="240" w:lineRule="auto"/>
+              <w:ind w:left="60" w:right="60" w:firstLine="0"/>
+              <w:jc w:val="left"/>
+              <w:rPr/>
+            </w:pPr>
+            <w:r>
+              <w:rPr>
+                <w:rFonts w:ascii="Open Sans SemiBold" w:cs="Open Sans SemiBold" w:eastAsia="Open Sans SemiBold" w:hAnsi="Open Sans SemiBold"/>
+                <w:color w:val="ffffff"/>
+                <w:sz w:val="18"/>
+                <w:szCs w:val="18"/>
+                <w:rtl w:val="0"/>
               </w:rPr>
               <w:t xml:space="preserve">Fase</w:t>
             </w:r>
@@ -1414,13 +2666,24 @@
         </w:tc>
         <w:tc>
           <w:tcPr>
-            <w:tcW w:w="3200" w:type="dxa"/>
-          </w:tcPr>
-          <w:p>
-            <w:r>
-              <w:rPr>
-                <w:b w:val="1"/>
-                <w:bCs w:val="1"/>
+            <w:tcW w:w="3100" w:type="dxa"/>
+            <w:shd w:fill="282d68" w:val="clear"/>
+            <w:vAlign w:val="center"/>
+          </w:tcPr>
+          <w:p>
+            <w:pPr>
+              <w:spacing w:after="40" w:before="40" w:line="240" w:lineRule="auto"/>
+              <w:ind w:left="60" w:right="60" w:firstLine="0"/>
+              <w:jc w:val="left"/>
+              <w:rPr/>
+            </w:pPr>
+            <w:r>
+              <w:rPr>
+                <w:rFonts w:ascii="Open Sans SemiBold" w:cs="Open Sans SemiBold" w:eastAsia="Open Sans SemiBold" w:hAnsi="Open Sans SemiBold"/>
+                <w:color w:val="ffffff"/>
+                <w:sz w:val="18"/>
+                <w:szCs w:val="18"/>
+                <w:rtl w:val="0"/>
               </w:rPr>
               <w:t xml:space="preserve">Qué capacidad hace falta</w:t>
             </w:r>
@@ -1428,13 +2691,24 @@
         </w:tc>
         <w:tc>
           <w:tcPr>
-            <w:tcW w:w="3260" w:type="dxa"/>
-          </w:tcPr>
-          <w:p>
-            <w:r>
-              <w:rPr>
-                <w:b w:val="1"/>
-                <w:bCs w:val="1"/>
+            <w:tcW w:w="3460" w:type="dxa"/>
+            <w:shd w:fill="282d68" w:val="clear"/>
+            <w:vAlign w:val="center"/>
+          </w:tcPr>
+          <w:p>
+            <w:pPr>
+              <w:spacing w:after="40" w:before="40" w:line="240" w:lineRule="auto"/>
+              <w:ind w:left="60" w:right="60" w:firstLine="0"/>
+              <w:jc w:val="left"/>
+              <w:rPr/>
+            </w:pPr>
+            <w:r>
+              <w:rPr>
+                <w:rFonts w:ascii="Open Sans SemiBold" w:cs="Open Sans SemiBold" w:eastAsia="Open Sans SemiBold" w:hAnsi="Open Sans SemiBold"/>
+                <w:color w:val="ffffff"/>
+                <w:sz w:val="18"/>
+                <w:szCs w:val="18"/>
+                <w:rtl w:val="0"/>
               </w:rPr>
               <w:t xml:space="preserve">Con qué se cubre hoy</w:t>
             </w:r>
@@ -1443,12 +2717,23 @@
         <w:tc>
           <w:tcPr>
             <w:tcW w:w="1400" w:type="dxa"/>
-          </w:tcPr>
-          <w:p>
-            <w:r>
-              <w:rPr>
-                <w:b w:val="1"/>
-                <w:bCs w:val="1"/>
+            <w:shd w:fill="282d68" w:val="clear"/>
+            <w:vAlign w:val="center"/>
+          </w:tcPr>
+          <w:p>
+            <w:pPr>
+              <w:spacing w:after="40" w:before="40" w:line="240" w:lineRule="auto"/>
+              <w:ind w:left="60" w:right="60" w:firstLine="0"/>
+              <w:jc w:val="left"/>
+              <w:rPr/>
+            </w:pPr>
+            <w:r>
+              <w:rPr>
+                <w:rFonts w:ascii="Open Sans SemiBold" w:cs="Open Sans SemiBold" w:eastAsia="Open Sans SemiBold" w:hAnsi="Open Sans SemiBold"/>
+                <w:color w:val="ffffff"/>
+                <w:sz w:val="18"/>
+                <w:szCs w:val="18"/>
+                <w:rtl w:val="0"/>
               </w:rPr>
               <w:t xml:space="preserve">Estado</w:t>
             </w:r>
@@ -1456,32 +2741,77 @@
         </w:tc>
       </w:tr>
       <w:tr>
-        <w:tc>
-          <w:tcPr>
-            <w:tcW w:w="1500" w:type="dxa"/>
-          </w:tcPr>
-          <w:p>
-            <w:r>
+        <w:trPr>
+          <w:cantSplit w:val="0"/>
+        </w:trPr>
+        <w:tc>
+          <w:tcPr>
+            <w:tcW w:w="1400" w:type="dxa"/>
+            <w:shd w:fill="ffffff" w:val="clear"/>
+            <w:vAlign w:val="center"/>
+          </w:tcPr>
+          <w:p>
+            <w:pPr>
+              <w:spacing w:after="40" w:before="40" w:line="240" w:lineRule="auto"/>
+              <w:ind w:left="60" w:right="60" w:firstLine="0"/>
+              <w:jc w:val="left"/>
+              <w:rPr/>
+            </w:pPr>
+            <w:r>
+              <w:rPr>
+                <w:rFonts w:ascii="Open Sans" w:cs="Open Sans" w:eastAsia="Open Sans" w:hAnsi="Open Sans"/>
+                <w:sz w:val="18"/>
+                <w:szCs w:val="18"/>
+                <w:rtl w:val="0"/>
+              </w:rPr>
               <w:t xml:space="preserve">Inception</w:t>
             </w:r>
           </w:p>
         </w:tc>
         <w:tc>
           <w:tcPr>
-            <w:tcW w:w="3200" w:type="dxa"/>
-          </w:tcPr>
-          <w:p>
-            <w:r>
+            <w:tcW w:w="3100" w:type="dxa"/>
+            <w:shd w:fill="ffffff" w:val="clear"/>
+            <w:vAlign w:val="center"/>
+          </w:tcPr>
+          <w:p>
+            <w:pPr>
+              <w:spacing w:after="40" w:before="40" w:line="240" w:lineRule="auto"/>
+              <w:ind w:left="60" w:right="60" w:firstLine="0"/>
+              <w:jc w:val="left"/>
+              <w:rPr/>
+            </w:pPr>
+            <w:r>
+              <w:rPr>
+                <w:rFonts w:ascii="Open Sans" w:cs="Open Sans" w:eastAsia="Open Sans" w:hAnsi="Open Sans"/>
+                <w:sz w:val="18"/>
+                <w:szCs w:val="18"/>
+                <w:rtl w:val="0"/>
+              </w:rPr>
               <w:t xml:space="preserve">Producir la spec en tres artefactos, cada uno con aprobación explícita</w:t>
             </w:r>
           </w:p>
         </w:tc>
         <w:tc>
           <w:tcPr>
-            <w:tcW w:w="3260" w:type="dxa"/>
-          </w:tcPr>
-          <w:p>
-            <w:r>
+            <w:tcW w:w="3460" w:type="dxa"/>
+            <w:shd w:fill="ffffff" w:val="clear"/>
+            <w:vAlign w:val="center"/>
+          </w:tcPr>
+          <w:p>
+            <w:pPr>
+              <w:spacing w:after="40" w:before="40" w:line="240" w:lineRule="auto"/>
+              <w:ind w:left="60" w:right="60" w:firstLine="0"/>
+              <w:jc w:val="left"/>
+              <w:rPr/>
+            </w:pPr>
+            <w:r>
+              <w:rPr>
+                <w:rFonts w:ascii="Open Sans" w:cs="Open Sans" w:eastAsia="Open Sans" w:hAnsi="Open Sans"/>
+                <w:sz w:val="18"/>
+                <w:szCs w:val="18"/>
+                <w:rtl w:val="0"/>
+              </w:rPr>
               <w:t xml:space="preserve">Kiro</w:t>
             </w:r>
           </w:p>
@@ -1489,41 +2819,100 @@
         <w:tc>
           <w:tcPr>
             <w:tcW w:w="1400" w:type="dxa"/>
-          </w:tcPr>
-          <w:p>
-            <w:r>
+            <w:shd w:fill="ffffff" w:val="clear"/>
+            <w:vAlign w:val="center"/>
+          </w:tcPr>
+          <w:p>
+            <w:pPr>
+              <w:spacing w:after="40" w:before="40" w:line="240" w:lineRule="auto"/>
+              <w:ind w:left="60" w:right="60" w:firstLine="0"/>
+              <w:jc w:val="left"/>
+              <w:rPr/>
+            </w:pPr>
+            <w:r>
+              <w:rPr>
+                <w:rFonts w:ascii="Open Sans" w:cs="Open Sans" w:eastAsia="Open Sans" w:hAnsi="Open Sans"/>
+                <w:sz w:val="18"/>
+                <w:szCs w:val="18"/>
+                <w:rtl w:val="0"/>
+              </w:rPr>
               <w:t xml:space="preserve">Propuesto</w:t>
             </w:r>
           </w:p>
         </w:tc>
       </w:tr>
       <w:tr>
-        <w:tc>
-          <w:tcPr>
-            <w:tcW w:w="1500" w:type="dxa"/>
-          </w:tcPr>
-          <w:p>
-            <w:r>
+        <w:trPr>
+          <w:cantSplit w:val="0"/>
+        </w:trPr>
+        <w:tc>
+          <w:tcPr>
+            <w:tcW w:w="1400" w:type="dxa"/>
+            <w:shd w:fill="ffffff" w:val="clear"/>
+            <w:vAlign w:val="center"/>
+          </w:tcPr>
+          <w:p>
+            <w:pPr>
+              <w:spacing w:after="40" w:before="40" w:line="240" w:lineRule="auto"/>
+              <w:ind w:left="60" w:right="60" w:firstLine="0"/>
+              <w:jc w:val="left"/>
+              <w:rPr/>
+            </w:pPr>
+            <w:r>
+              <w:rPr>
+                <w:rFonts w:ascii="Open Sans" w:cs="Open Sans" w:eastAsia="Open Sans" w:hAnsi="Open Sans"/>
+                <w:sz w:val="18"/>
+                <w:szCs w:val="18"/>
+                <w:rtl w:val="0"/>
+              </w:rPr>
               <w:t xml:space="preserve">Construction</w:t>
             </w:r>
           </w:p>
         </w:tc>
         <w:tc>
           <w:tcPr>
-            <w:tcW w:w="3200" w:type="dxa"/>
-          </w:tcPr>
-          <w:p>
-            <w:r>
+            <w:tcW w:w="3100" w:type="dxa"/>
+            <w:shd w:fill="ffffff" w:val="clear"/>
+            <w:vAlign w:val="center"/>
+          </w:tcPr>
+          <w:p>
+            <w:pPr>
+              <w:spacing w:after="40" w:before="40" w:line="240" w:lineRule="auto"/>
+              <w:ind w:left="60" w:right="60" w:firstLine="0"/>
+              <w:jc w:val="left"/>
+              <w:rPr/>
+            </w:pPr>
+            <w:r>
+              <w:rPr>
+                <w:rFonts w:ascii="Open Sans" w:cs="Open Sans" w:eastAsia="Open Sans" w:hAnsi="Open Sans"/>
+                <w:sz w:val="18"/>
+                <w:szCs w:val="18"/>
+                <w:rtl w:val="0"/>
+              </w:rPr>
               <w:t xml:space="preserve">Un asistente que cargue las reglas del repositorio, y una revisión con veredicto antes de integrar</w:t>
             </w:r>
           </w:p>
         </w:tc>
         <w:tc>
           <w:tcPr>
-            <w:tcW w:w="3260" w:type="dxa"/>
-          </w:tcPr>
-          <w:p>
-            <w:r>
+            <w:tcW w:w="3460" w:type="dxa"/>
+            <w:shd w:fill="ffffff" w:val="clear"/>
+            <w:vAlign w:val="center"/>
+          </w:tcPr>
+          <w:p>
+            <w:pPr>
+              <w:spacing w:after="40" w:before="40" w:line="240" w:lineRule="auto"/>
+              <w:ind w:left="60" w:right="60" w:firstLine="0"/>
+              <w:jc w:val="left"/>
+              <w:rPr/>
+            </w:pPr>
+            <w:r>
+              <w:rPr>
+                <w:rFonts w:ascii="Open Sans" w:cs="Open Sans" w:eastAsia="Open Sans" w:hAnsi="Open Sans"/>
+                <w:sz w:val="18"/>
+                <w:szCs w:val="18"/>
+                <w:rtl w:val="0"/>
+              </w:rPr>
               <w:t xml:space="preserve">Claude Code; Forge, orquestación de corridas autónomas con revisores y veredicto PASS/DENY/DENYSPEC</w:t>
             </w:r>
           </w:p>
@@ -1531,41 +2920,100 @@
         <w:tc>
           <w:tcPr>
             <w:tcW w:w="1400" w:type="dxa"/>
-          </w:tcPr>
-          <w:p>
-            <w:r>
+            <w:shd w:fill="ffffff" w:val="clear"/>
+            <w:vAlign w:val="center"/>
+          </w:tcPr>
+          <w:p>
+            <w:pPr>
+              <w:spacing w:after="40" w:before="40" w:line="240" w:lineRule="auto"/>
+              <w:ind w:left="60" w:right="60" w:firstLine="0"/>
+              <w:jc w:val="left"/>
+              <w:rPr/>
+            </w:pPr>
+            <w:r>
+              <w:rPr>
+                <w:rFonts w:ascii="Open Sans" w:cs="Open Sans" w:eastAsia="Open Sans" w:hAnsi="Open Sans"/>
+                <w:sz w:val="18"/>
+                <w:szCs w:val="18"/>
+                <w:rtl w:val="0"/>
+              </w:rPr>
               <w:t xml:space="preserve">Real</w:t>
             </w:r>
           </w:p>
         </w:tc>
       </w:tr>
       <w:tr>
-        <w:tc>
-          <w:tcPr>
-            <w:tcW w:w="1500" w:type="dxa"/>
-          </w:tcPr>
-          <w:p>
-            <w:r>
+        <w:trPr>
+          <w:cantSplit w:val="0"/>
+        </w:trPr>
+        <w:tc>
+          <w:tcPr>
+            <w:tcW w:w="1400" w:type="dxa"/>
+            <w:shd w:fill="ffffff" w:val="clear"/>
+            <w:vAlign w:val="center"/>
+          </w:tcPr>
+          <w:p>
+            <w:pPr>
+              <w:spacing w:after="40" w:before="40" w:line="240" w:lineRule="auto"/>
+              <w:ind w:left="60" w:right="60" w:firstLine="0"/>
+              <w:jc w:val="left"/>
+              <w:rPr/>
+            </w:pPr>
+            <w:r>
+              <w:rPr>
+                <w:rFonts w:ascii="Open Sans" w:cs="Open Sans" w:eastAsia="Open Sans" w:hAnsi="Open Sans"/>
+                <w:sz w:val="18"/>
+                <w:szCs w:val="18"/>
+                <w:rtl w:val="0"/>
+              </w:rPr>
               <w:t xml:space="preserve">Operations</w:t>
             </w:r>
           </w:p>
         </w:tc>
         <w:tc>
           <w:tcPr>
-            <w:tcW w:w="3200" w:type="dxa"/>
-          </w:tcPr>
-          <w:p>
-            <w:r>
+            <w:tcW w:w="3100" w:type="dxa"/>
+            <w:shd w:fill="ffffff" w:val="clear"/>
+            <w:vAlign w:val="center"/>
+          </w:tcPr>
+          <w:p>
+            <w:pPr>
+              <w:spacing w:after="40" w:before="40" w:line="240" w:lineRule="auto"/>
+              <w:ind w:left="60" w:right="60" w:firstLine="0"/>
+              <w:jc w:val="left"/>
+              <w:rPr/>
+            </w:pPr>
+            <w:r>
+              <w:rPr>
+                <w:rFonts w:ascii="Open Sans" w:cs="Open Sans" w:eastAsia="Open Sans" w:hAnsi="Open Sans"/>
+                <w:sz w:val="18"/>
+                <w:szCs w:val="18"/>
+                <w:rtl w:val="0"/>
+              </w:rPr>
               <w:t xml:space="preserve">Verificaciones automáticas en cada cambio</w:t>
             </w:r>
           </w:p>
         </w:tc>
         <w:tc>
           <w:tcPr>
-            <w:tcW w:w="3260" w:type="dxa"/>
-          </w:tcPr>
-          <w:p>
-            <w:r>
+            <w:tcW w:w="3460" w:type="dxa"/>
+            <w:shd w:fill="ffffff" w:val="clear"/>
+            <w:vAlign w:val="center"/>
+          </w:tcPr>
+          <w:p>
+            <w:pPr>
+              <w:spacing w:after="40" w:before="40" w:line="240" w:lineRule="auto"/>
+              <w:ind w:left="60" w:right="60" w:firstLine="0"/>
+              <w:jc w:val="left"/>
+              <w:rPr/>
+            </w:pPr>
+            <w:r>
+              <w:rPr>
+                <w:rFonts w:ascii="Open Sans" w:cs="Open Sans" w:eastAsia="Open Sans" w:hAnsi="Open Sans"/>
+                <w:sz w:val="18"/>
+                <w:szCs w:val="18"/>
+                <w:rtl w:val="0"/>
+              </w:rPr>
               <w:t xml:space="preserve">El CI de cada proyecto, con definiciones por stack</w:t>
             </w:r>
           </w:p>
@@ -1573,9 +3021,23 @@
         <w:tc>
           <w:tcPr>
             <w:tcW w:w="1400" w:type="dxa"/>
-          </w:tcPr>
-          <w:p>
-            <w:r>
+            <w:shd w:fill="ffffff" w:val="clear"/>
+            <w:vAlign w:val="center"/>
+          </w:tcPr>
+          <w:p>
+            <w:pPr>
+              <w:spacing w:after="40" w:before="40" w:line="240" w:lineRule="auto"/>
+              <w:ind w:left="60" w:right="60" w:firstLine="0"/>
+              <w:jc w:val="left"/>
+              <w:rPr/>
+            </w:pPr>
+            <w:r>
+              <w:rPr>
+                <w:rFonts w:ascii="Open Sans" w:cs="Open Sans" w:eastAsia="Open Sans" w:hAnsi="Open Sans"/>
+                <w:sz w:val="18"/>
+                <w:szCs w:val="18"/>
+                <w:rtl w:val="0"/>
+              </w:rPr>
               <w:t xml:space="preserve">Real</w:t>
             </w:r>
           </w:p>
@@ -1583,90 +3045,252 @@
       </w:tr>
     </w:tbl>
     <w:p>
-      <w:r>
+      <w:pPr>
+        <w:spacing w:after="0" w:before="0"/>
+        <w:ind w:left="720" w:firstLine="0"/>
+        <w:rPr/>
+      </w:pPr>
+    </w:p>
+    <w:p>
+      <w:pPr>
+        <w:spacing w:after="200" w:before="0" w:lineRule="auto"/>
+        <w:ind w:left="720" w:firstLine="0"/>
+        <w:jc w:val="both"/>
+        <w:rPr/>
+      </w:pPr>
+      <w:r>
+        <w:rPr>
+          <w:rFonts w:ascii="Open Sans" w:cs="Open Sans" w:eastAsia="Open Sans" w:hAnsi="Open Sans"/>
+          <w:sz w:val="21"/>
+          <w:szCs w:val="21"/>
+          <w:rtl w:val="0"/>
+        </w:rPr>
         <w:t xml:space="preserve">La herramienta importa menos que lo que se le carga. Una skill es un paquete de estándares e instrucciones que la herramienta levanta sola cuando la tarea coincide, y con eso todos recorren el mismo camino sin tener que acordarse de nada.</w:t>
       </w:r>
     </w:p>
     <w:p>
-      <w:r>
+      <w:pPr>
+        <w:spacing w:after="200" w:before="0" w:lineRule="auto"/>
+        <w:ind w:left="720" w:firstLine="0"/>
+        <w:jc w:val="both"/>
+        <w:rPr/>
+      </w:pPr>
+      <w:r>
+        <w:rPr>
+          <w:rFonts w:ascii="Open Sans" w:cs="Open Sans" w:eastAsia="Open Sans" w:hAnsi="Open Sans"/>
+          <w:sz w:val="21"/>
+          <w:szCs w:val="21"/>
+          <w:rtl w:val="0"/>
+        </w:rPr>
         <w:t xml:space="preserve">Ese mecanismo tiene un límite: funciona mientras alguien lo invoque. Por eso una regla que importa de verdad no se queda escrita, baja al CI o a un hook de git y actúa sin que nadie la llame.</w:t>
       </w:r>
     </w:p>
     <w:p>
-      <w:r>
+      <w:pPr>
+        <w:spacing w:after="200" w:before="0" w:lineRule="auto"/>
+        <w:ind w:left="720" w:firstLine="0"/>
+        <w:jc w:val="both"/>
+        <w:rPr/>
+      </w:pPr>
+      <w:r>
+        <w:rPr>
+          <w:rFonts w:ascii="Open Sans" w:cs="Open Sans" w:eastAsia="Open Sans" w:hAnsi="Open Sans"/>
+          <w:sz w:val="21"/>
+          <w:szCs w:val="21"/>
+          <w:rtl w:val="0"/>
+        </w:rPr>
         <w:t xml:space="preserve">El resto se queda donde ya está. La metodología apunta y no duplica: cada herramienta mantiene su propia documentación.</w:t>
       </w:r>
     </w:p>
     <w:p>
       <w:pPr>
         <w:pStyle w:val="Heading1"/>
+        <w:spacing w:after="120" w:before="240" w:line="240" w:lineRule="auto"/>
+        <w:ind w:left="720" w:firstLine="0"/>
+        <w:jc w:val="left"/>
+        <w:rPr>
+          <w:color w:val="0084d5"/>
+        </w:rPr>
       </w:pPr>
       <w:r>
         <w:br w:type="page"/>
       </w:r>
       <w:r>
+        <w:rPr>
+          <w:rFonts w:ascii="Poppins" w:cs="Poppins" w:eastAsia="Poppins" w:hAnsi="Poppins"/>
+          <w:b w:val="1"/>
+          <w:bCs w:val="1"/>
+          <w:color w:val="0084d5"/>
+          <w:sz w:val="42"/>
+          <w:szCs w:val="42"/>
+          <w:rtl w:val="0"/>
+        </w:rPr>
         <w:t xml:space="preserve">7. GOBERNANZA</w:t>
       </w:r>
     </w:p>
     <w:p>
-      <w:r>
+      <w:pPr>
+        <w:spacing w:after="200" w:before="0" w:lineRule="auto"/>
+        <w:ind w:left="720" w:firstLine="0"/>
+        <w:jc w:val="both"/>
+        <w:rPr/>
+      </w:pPr>
+      <w:r>
+        <w:rPr>
+          <w:rFonts w:ascii="Open Sans" w:cs="Open Sans" w:eastAsia="Open Sans" w:hAnsi="Open Sans"/>
+          <w:sz w:val="21"/>
+          <w:szCs w:val="21"/>
+          <w:rtl w:val="0"/>
+        </w:rPr>
         <w:t xml:space="preserve">El proceso deja constancia de quién decidió qué. Esa constancia es lo que responde a un auditor o al oficial de cumplimiento de un cliente.</w:t>
       </w:r>
     </w:p>
     <w:p>
-      <w:r>
+      <w:pPr>
+        <w:spacing w:after="200" w:before="0" w:lineRule="auto"/>
+        <w:ind w:left="720" w:firstLine="0"/>
+        <w:jc w:val="both"/>
+        <w:rPr/>
+      </w:pPr>
+      <w:r>
+        <w:rPr>
+          <w:rFonts w:ascii="Open Sans" w:cs="Open Sans" w:eastAsia="Open Sans" w:hAnsi="Open Sans"/>
+          <w:sz w:val="21"/>
+          <w:szCs w:val="21"/>
+          <w:rtl w:val="0"/>
+        </w:rPr>
         <w:t xml:space="preserve">La política de gobernanza de IA del grupo fija la regla que gobierna todo lo demás:</w:t>
       </w:r>
     </w:p>
     <w:p>
       <w:pPr>
         <w:pBdr>
-          <w:left w:val="single" w:sz="18" w:space="12" w:color="2E86C1"/>
+          <w:left w:val="single" w:sz="18" w:space="10" w:color="0084d5"/>
         </w:pBdr>
-        <w:spacing w:before="200" w:after="200"/>
-        <w:ind w:left="720" w:right="720"/>
-      </w:pPr>
-      <w:r>
-        <w:rPr>
-          <w:i w:val="1"/>
-          <w:iCs w:val="1"/>
+        <w:spacing w:after="200" w:before="200" w:lineRule="auto"/>
+        <w:ind w:left="1080" w:right="720" w:firstLine="0"/>
+        <w:jc w:val="left"/>
+        <w:rPr/>
+      </w:pPr>
+      <w:r>
+        <w:rPr>
+          <w:rFonts w:ascii="Open Sans SemiBold" w:cs="Open Sans SemiBold" w:eastAsia="Open Sans SemiBold" w:hAnsi="Open Sans SemiBold"/>
+          <w:color w:val="282d68"/>
+          <w:sz w:val="22"/>
+          <w:szCs w:val="22"/>
+          <w:rtl w:val="0"/>
         </w:rPr>
         <w:t xml:space="preserve">Todo código generado por IA pasa revisión humana antes de integrarse. El merge lo ejecuta siempre una persona identificable.</w:t>
       </w:r>
     </w:p>
     <w:p>
-      <w:r>
+      <w:pPr>
+        <w:spacing w:after="200" w:before="0" w:lineRule="auto"/>
+        <w:ind w:left="720" w:firstLine="0"/>
+        <w:jc w:val="both"/>
+        <w:rPr/>
+      </w:pPr>
+      <w:r>
+        <w:rPr>
+          <w:rFonts w:ascii="Open Sans" w:cs="Open Sans" w:eastAsia="Open Sans" w:hAnsi="Open Sans"/>
+          <w:sz w:val="21"/>
+          <w:szCs w:val="21"/>
+          <w:rtl w:val="0"/>
+        </w:rPr>
         <w:t xml:space="preserve">La responsabilidad de cada cambio recae siempre en una persona con nombre; ningún agente es Accountable de nada, nunca.</w:t>
       </w:r>
     </w:p>
     <w:p>
-      <w:r>
+      <w:pPr>
+        <w:spacing w:after="200" w:before="0" w:lineRule="auto"/>
+        <w:ind w:left="720" w:firstLine="0"/>
+        <w:jc w:val="both"/>
+        <w:rPr/>
+      </w:pPr>
+      <w:r>
+        <w:rPr>
+          <w:rFonts w:ascii="Open Sans" w:cs="Open Sans" w:eastAsia="Open Sans" w:hAnsi="Open Sans"/>
+          <w:sz w:val="21"/>
+          <w:szCs w:val="21"/>
+          <w:rtl w:val="0"/>
+        </w:rPr>
         <w:t xml:space="preserve">Esa regla se sostiene sobre lo que el ciclo va dejando escrito. Los artefactos no se descartan al cerrar cada fase: la prueba lleva al código, el código al requisito y el requisito a la historia de usuario que lo originó. AWS señala esa trazabilidad de punta a punta como el requisito crítico para la revisión regulatoria, y es lo que permite reconstruir después por qué el sistema hace lo que hace.</w:t>
       </w:r>
     </w:p>
     <w:p>
-      <w:r>
+      <w:pPr>
+        <w:spacing w:after="200" w:before="0" w:lineRule="auto"/>
+        <w:ind w:left="720" w:firstLine="0"/>
+        <w:jc w:val="both"/>
+        <w:rPr/>
+      </w:pPr>
+      <w:r>
+        <w:rPr>
+          <w:rFonts w:ascii="Open Sans" w:cs="Open Sans" w:eastAsia="Open Sans" w:hAnsi="Open Sans"/>
+          <w:sz w:val="21"/>
+          <w:szCs w:val="21"/>
+          <w:rtl w:val="0"/>
+        </w:rPr>
         <w:t xml:space="preserve">Lo que no salió bien también queda registrado. Toda escalación, incidente o sorpresa relevante produce un post-mortem corto con número correlativo. No es burocracia: sus conclusiones se convierten en cambios concretos, sea una regla, una skill o una verificación del CI.</w:t>
       </w:r>
     </w:p>
     <w:p>
       <w:pPr>
         <w:pStyle w:val="Heading1"/>
+        <w:spacing w:after="120" w:before="240" w:line="240" w:lineRule="auto"/>
+        <w:ind w:left="720" w:firstLine="0"/>
+        <w:jc w:val="left"/>
+        <w:rPr>
+          <w:color w:val="0084d5"/>
+        </w:rPr>
       </w:pPr>
       <w:r>
         <w:br w:type="page"/>
       </w:r>
       <w:r>
+        <w:rPr>
+          <w:rFonts w:ascii="Poppins" w:cs="Poppins" w:eastAsia="Poppins" w:hAnsi="Poppins"/>
+          <w:b w:val="1"/>
+          <w:bCs w:val="1"/>
+          <w:color w:val="0084d5"/>
+          <w:sz w:val="42"/>
+          <w:szCs w:val="42"/>
+          <w:rtl w:val="0"/>
+        </w:rPr>
         <w:t xml:space="preserve">8. ADOPCIÓN</w:t>
       </w:r>
     </w:p>
     <w:p>
-      <w:r>
+      <w:pPr>
+        <w:spacing w:after="200" w:before="0" w:lineRule="auto"/>
+        <w:ind w:left="720" w:firstLine="0"/>
+        <w:jc w:val="both"/>
+        <w:rPr/>
+      </w:pPr>
+      <w:r>
+        <w:rPr>
+          <w:rFonts w:ascii="Open Sans" w:cs="Open Sans" w:eastAsia="Open Sans" w:hAnsi="Open Sans"/>
+          <w:sz w:val="21"/>
+          <w:szCs w:val="21"/>
+          <w:rtl w:val="0"/>
+        </w:rPr>
         <w:t xml:space="preserve">La inducción al método es la misma para todo el equipo, sin importar el proyecto en el que esté. El método no se estudia, se practica: los rituales se aprenden ejecutándolos sobre trabajo real.</w:t>
       </w:r>
     </w:p>
     <w:p>
-      <w:r>
+      <w:pPr>
+        <w:spacing w:after="200" w:before="0" w:lineRule="auto"/>
+        <w:ind w:left="720" w:firstLine="0"/>
+        <w:jc w:val="both"/>
+        <w:rPr/>
+      </w:pPr>
+      <w:r>
+        <w:rPr>
+          <w:rFonts w:ascii="Open Sans" w:cs="Open Sans" w:eastAsia="Open Sans" w:hAnsi="Open Sans"/>
+          <w:sz w:val="21"/>
+          <w:szCs w:val="21"/>
+          <w:rtl w:val="0"/>
+        </w:rPr>
         <w:t xml:space="preserve">La inducción tiene cuatro piezas:</w:t>
       </w:r>
     </w:p>
@@ -1676,16 +3300,27 @@
           <w:ilvl w:val="0"/>
           <w:numId w:val="1"/>
         </w:numPr>
-        <w:ind w:left="720" w:hanging="360"/>
-      </w:pPr>
-      <w:r>
-        <w:rPr>
-          <w:b w:val="1"/>
-          <w:bCs w:val="1"/>
+        <w:spacing w:after="80" w:before="0" w:lineRule="auto"/>
+        <w:ind w:left="1080" w:hanging="360"/>
+        <w:jc w:val="left"/>
+        <w:rPr/>
+      </w:pPr>
+      <w:r>
+        <w:rPr>
+          <w:rFonts w:ascii="Open Sans SemiBold" w:cs="Open Sans SemiBold" w:eastAsia="Open Sans SemiBold" w:hAnsi="Open Sans SemiBold"/>
+          <w:sz w:val="21"/>
+          <w:szCs w:val="21"/>
+          <w:rtl w:val="0"/>
         </w:rPr>
         <w:t xml:space="preserve">Este documento</w:t>
       </w:r>
       <w:r>
+        <w:rPr>
+          <w:rFonts w:ascii="Open Sans" w:cs="Open Sans" w:eastAsia="Open Sans" w:hAnsi="Open Sans"/>
+          <w:sz w:val="21"/>
+          <w:szCs w:val="21"/>
+          <w:rtl w:val="0"/>
+        </w:rPr>
         <w:t xml:space="preserve"> — el vocabulario, el ciclo completo y por qué el método importa.</w:t>
       </w:r>
     </w:p>
@@ -1695,16 +3330,27 @@
           <w:ilvl w:val="0"/>
           <w:numId w:val="1"/>
         </w:numPr>
-        <w:ind w:left="720" w:hanging="360"/>
-      </w:pPr>
-      <w:r>
-        <w:rPr>
-          <w:b w:val="1"/>
-          <w:bCs w:val="1"/>
+        <w:spacing w:after="80" w:before="0" w:lineRule="auto"/>
+        <w:ind w:left="1080" w:hanging="360"/>
+        <w:jc w:val="left"/>
+        <w:rPr/>
+      </w:pPr>
+      <w:r>
+        <w:rPr>
+          <w:rFonts w:ascii="Open Sans SemiBold" w:cs="Open Sans SemiBold" w:eastAsia="Open Sans SemiBold" w:hAnsi="Open Sans SemiBold"/>
+          <w:sz w:val="21"/>
+          <w:szCs w:val="21"/>
+          <w:rtl w:val="0"/>
         </w:rPr>
         <w:t xml:space="preserve">Las herramientas del proyecto</w:t>
       </w:r>
       <w:r>
+        <w:rPr>
+          <w:rFonts w:ascii="Open Sans" w:cs="Open Sans" w:eastAsia="Open Sans" w:hAnsi="Open Sans"/>
+          <w:sz w:val="21"/>
+          <w:szCs w:val="21"/>
+          <w:rtl w:val="0"/>
+        </w:rPr>
         <w:t xml:space="preserve"> — instaladas y configuradas, con las reglas del repositorio cargadas.</w:t>
       </w:r>
     </w:p>
@@ -1714,16 +3360,27 @@
           <w:ilvl w:val="0"/>
           <w:numId w:val="1"/>
         </w:numPr>
-        <w:ind w:left="720" w:hanging="360"/>
-      </w:pPr>
-      <w:r>
-        <w:rPr>
-          <w:b w:val="1"/>
-          <w:bCs w:val="1"/>
+        <w:spacing w:after="80" w:before="0" w:lineRule="auto"/>
+        <w:ind w:left="1080" w:hanging="360"/>
+        <w:jc w:val="left"/>
+        <w:rPr/>
+      </w:pPr>
+      <w:r>
+        <w:rPr>
+          <w:rFonts w:ascii="Open Sans SemiBold" w:cs="Open Sans SemiBold" w:eastAsia="Open Sans SemiBold" w:hAnsi="Open Sans SemiBold"/>
+          <w:sz w:val="21"/>
+          <w:szCs w:val="21"/>
+          <w:rtl w:val="0"/>
         </w:rPr>
         <w:t xml:space="preserve">El flujo de un cambio</w:t>
       </w:r>
       <w:r>
+        <w:rPr>
+          <w:rFonts w:ascii="Open Sans" w:cs="Open Sans" w:eastAsia="Open Sans" w:hAnsi="Open Sans"/>
+          <w:sz w:val="21"/>
+          <w:szCs w:val="21"/>
+          <w:rtl w:val="0"/>
+        </w:rPr>
         <w:t xml:space="preserve"> — un caso recorrido de principio a fin, del Intent al despliegue.</w:t>
       </w:r>
     </w:p>
@@ -1733,32 +3390,77 @@
           <w:ilvl w:val="0"/>
           <w:numId w:val="1"/>
         </w:numPr>
-        <w:ind w:left="720" w:hanging="360"/>
-      </w:pPr>
-      <w:r>
-        <w:rPr>
+        <w:spacing w:after="80" w:before="0" w:lineRule="auto"/>
+        <w:ind w:left="1080" w:hanging="360"/>
+        <w:jc w:val="left"/>
+        <w:rPr/>
+      </w:pPr>
+      <w:r>
+        <w:rPr>
+          <w:rFonts w:ascii="Open Sans SemiBold" w:cs="Open Sans SemiBold" w:eastAsia="Open Sans SemiBold" w:hAnsi="Open Sans SemiBold"/>
+          <w:sz w:val="21"/>
+          <w:szCs w:val="21"/>
+          <w:rtl w:val="0"/>
+        </w:rPr>
+        <w:t xml:space="preserve">El primer trabajo acompañado</w:t>
+      </w:r>
+      <w:r>
+        <w:rPr>
+          <w:rFonts w:ascii="Open Sans" w:cs="Open Sans" w:eastAsia="Open Sans" w:hAnsi="Open Sans"/>
+          <w:sz w:val="21"/>
+          <w:szCs w:val="21"/>
+          <w:rtl w:val="0"/>
+        </w:rPr>
+        <w:t xml:space="preserve"> — un cambio real, no un ejercicio, junto a alguien que ya recorrió el ciclo.</w:t>
+      </w:r>
+    </w:p>
+    <w:p>
+      <w:pPr>
+        <w:spacing w:after="0" w:before="0"/>
+        <w:ind w:left="720" w:firstLine="0"/>
+        <w:rPr/>
+      </w:pPr>
+    </w:p>
+    <w:p>
+      <w:pPr>
+        <w:spacing w:after="200" w:before="0" w:lineRule="auto"/>
+        <w:ind w:left="720" w:firstLine="0"/>
+        <w:jc w:val="both"/>
+        <w:rPr/>
+      </w:pPr>
+      <w:r>
+        <w:rPr>
+          <w:rFonts w:ascii="Open Sans" w:cs="Open Sans" w:eastAsia="Open Sans" w:hAnsi="Open Sans"/>
+          <w:sz w:val="21"/>
+          <w:szCs w:val="21"/>
+          <w:rtl w:val="0"/>
+        </w:rPr>
+        <w:t xml:space="preserve">La inducción termina cuando ese primer cambio llega a producción.</w:t>
+      </w:r>
+    </w:p>
+    <w:p>
+      <w:pPr>
+        <w:pStyle w:val="Heading1"/>
+        <w:spacing w:after="120" w:before="240" w:line="240" w:lineRule="auto"/>
+        <w:ind w:left="720" w:firstLine="0"/>
+        <w:jc w:val="left"/>
+        <w:rPr>
+          <w:color w:val="0084d5"/>
+        </w:rPr>
+      </w:pPr>
+      <w:r>
+        <w:br w:type="page"/>
+      </w:r>
+      <w:r>
+        <w:rPr>
+          <w:rFonts w:ascii="Poppins" w:cs="Poppins" w:eastAsia="Poppins" w:hAnsi="Poppins"/>
           <w:b w:val="1"/>
           <w:bCs w:val="1"/>
-        </w:rPr>
-        <w:t xml:space="preserve">El primer trabajo acompañado</w:t>
-      </w:r>
-      <w:r>
-        <w:t xml:space="preserve"> — un cambio real, no un ejercicio, junto a alguien que ya recorrió el ciclo.</w:t>
-      </w:r>
-    </w:p>
-    <w:p>
-      <w:r>
-        <w:t xml:space="preserve">La inducción termina cuando ese primer cambio llega a producción.</w:t>
-      </w:r>
-    </w:p>
-    <w:p>
-      <w:pPr>
-        <w:pStyle w:val="Heading1"/>
-      </w:pPr>
-      <w:r>
-        <w:br w:type="page"/>
-      </w:r>
-      <w:r>
+          <w:color w:val="0084d5"/>
+          <w:sz w:val="42"/>
+          <w:szCs w:val="42"/>
+          <w:rtl w:val="0"/>
+        </w:rPr>
         <w:t xml:space="preserve">REFERENCIAS</w:t>
       </w:r>
     </w:p>
@@ -1768,9 +3470,18 @@
           <w:ilvl w:val="0"/>
           <w:numId w:val="1"/>
         </w:numPr>
-        <w:ind w:left="720" w:hanging="360"/>
-      </w:pPr>
-      <w:r>
+        <w:spacing w:after="80" w:before="0" w:lineRule="auto"/>
+        <w:ind w:left="1080" w:hanging="360"/>
+        <w:jc w:val="left"/>
+        <w:rPr/>
+      </w:pPr>
+      <w:r>
+        <w:rPr>
+          <w:rFonts w:ascii="Open Sans" w:cs="Open Sans" w:eastAsia="Open Sans" w:hAnsi="Open Sans"/>
+          <w:sz w:val="21"/>
+          <w:szCs w:val="21"/>
+          <w:rtl w:val="0"/>
+        </w:rPr>
         <w:t xml:space="preserve">AWS, Method Definition Paper de AI-DLC, julio de 2025: fases, artefactos, rituales y los nueve pasos del flujo.</w:t>
       </w:r>
     </w:p>
@@ -1780,9 +3491,18 @@
           <w:ilvl w:val="0"/>
           <w:numId w:val="1"/>
         </w:numPr>
-        <w:ind w:left="720" w:hanging="360"/>
-      </w:pPr>
-      <w:r>
+        <w:spacing w:after="80" w:before="0" w:lineRule="auto"/>
+        <w:ind w:left="1080" w:hanging="360"/>
+        <w:jc w:val="left"/>
+        <w:rPr/>
+      </w:pPr>
+      <w:r>
+        <w:rPr>
+          <w:rFonts w:ascii="Open Sans" w:cs="Open Sans" w:eastAsia="Open Sans" w:hAnsi="Open Sans"/>
+          <w:sz w:val="21"/>
+          <w:szCs w:val="21"/>
+          <w:rtl w:val="0"/>
+        </w:rPr>
         <w:t xml:space="preserve">AWS, blog «AI-Driven Development Life Cycle: Reimagining Software Engineering», 31 de julio de 2025.</w:t>
       </w:r>
     </w:p>
@@ -1792,9 +3512,18 @@
           <w:ilvl w:val="0"/>
           <w:numId w:val="1"/>
         </w:numPr>
-        <w:ind w:left="720" w:hanging="360"/>
-      </w:pPr>
-      <w:r>
+        <w:spacing w:after="80" w:before="0" w:lineRule="auto"/>
+        <w:ind w:left="1080" w:hanging="360"/>
+        <w:jc w:val="left"/>
+        <w:rPr/>
+      </w:pPr>
+      <w:r>
+        <w:rPr>
+          <w:rFonts w:ascii="Open Sans" w:cs="Open Sans" w:eastAsia="Open Sans" w:hAnsi="Open Sans"/>
+          <w:sz w:val="21"/>
+          <w:szCs w:val="21"/>
+          <w:rtl w:val="0"/>
+        </w:rPr>
         <w:t xml:space="preserve">AWS, blog «Building with AI-DLC using Amazon Q Developer», 29 de noviembre de 2025.</w:t>
       </w:r>
     </w:p>
@@ -1804,9 +3533,18 @@
           <w:ilvl w:val="0"/>
           <w:numId w:val="1"/>
         </w:numPr>
-        <w:ind w:left="720" w:hanging="360"/>
-      </w:pPr>
-      <w:r>
+        <w:spacing w:after="80" w:before="0" w:lineRule="auto"/>
+        <w:ind w:left="1080" w:hanging="360"/>
+        <w:jc w:val="left"/>
+        <w:rPr/>
+      </w:pPr>
+      <w:r>
+        <w:rPr>
+          <w:rFonts w:ascii="Open Sans" w:cs="Open Sans" w:eastAsia="Open Sans" w:hAnsi="Open Sans"/>
+          <w:sz w:val="21"/>
+          <w:szCs w:val="21"/>
+          <w:rtl w:val="0"/>
+        </w:rPr>
         <w:t xml:space="preserve">AWS, blog «AI-Driven Development Lifecycle for Financial Services», 26 de mayo de 2026: trazabilidad y controles en entornos regulados.</w:t>
       </w:r>
     </w:p>
@@ -1816,9 +3554,18 @@
           <w:ilvl w:val="0"/>
           <w:numId w:val="1"/>
         </w:numPr>
-        <w:ind w:left="720" w:hanging="360"/>
-      </w:pPr>
-      <w:r>
+        <w:spacing w:after="80" w:before="0" w:lineRule="auto"/>
+        <w:ind w:left="1080" w:hanging="360"/>
+        <w:jc w:val="left"/>
+        <w:rPr/>
+      </w:pPr>
+      <w:r>
+        <w:rPr>
+          <w:rFonts w:ascii="Open Sans" w:cs="Open Sans" w:eastAsia="Open Sans" w:hAnsi="Open Sans"/>
+          <w:sz w:val="21"/>
+          <w:szCs w:val="21"/>
+          <w:rtl w:val="0"/>
+        </w:rPr>
         <w:t xml:space="preserve">AWS, repositorio awslabs/aidlc-workflows, licencia MIT-0. La implementación 2.0 reorganiza el ciclo en más fases y etapas que las descritas aquí.</w:t>
       </w:r>
     </w:p>
@@ -1828,9 +3575,18 @@
           <w:ilvl w:val="0"/>
           <w:numId w:val="1"/>
         </w:numPr>
-        <w:ind w:left="720" w:hanging="360"/>
-      </w:pPr>
-      <w:r>
+        <w:spacing w:after="80" w:before="0" w:lineRule="auto"/>
+        <w:ind w:left="1080" w:hanging="360"/>
+        <w:jc w:val="left"/>
+        <w:rPr/>
+      </w:pPr>
+      <w:r>
+        <w:rPr>
+          <w:rFonts w:ascii="Open Sans" w:cs="Open Sans" w:eastAsia="Open Sans" w:hAnsi="Open Sans"/>
+          <w:sz w:val="21"/>
+          <w:szCs w:val="21"/>
+          <w:rtl w:val="0"/>
+        </w:rPr>
         <w:t xml:space="preserve">Política de gobernanza de IA del grupo, regla §13.5: revisión humana y merge humano.</w:t>
       </w:r>
     </w:p>

</xml_diff>

<commit_message>
Insertar las figuras finales del equipo en el documento
Las tres figuras definitivas reemplazan los borradores: mental model,
ciclo completo y nueve pasos. Quedan versionadas en figuras/ como
final-fig1, final-fig2 y final-fig3.

Co-Authored-By: Claude Fable 5 <noreply@anthropic.com>
Claude-Session: https://claude.ai/code/session_01DUfpVMYHsB8EzAou3Ubw1a
</commit_message>
<xml_diff>
--- a/documento/entregable/Metodologia-AI-DLC-v1.0.docx
+++ b/documento/entregable/Metodologia-AI-DLC-v1.0.docx
@@ -1293,9 +1293,9 @@
         </w:rPr>
         <w:drawing>
           <wp:inline distB="0" distT="0" distL="0" distR="0">
-            <wp:extent cx="5120640" cy="3929793"/>
+            <wp:extent cx="3840480" cy="3840480"/>
             <wp:effectExtent b="0" l="0" r="0" t="0"/>
-            <wp:docPr id="4337" name="figura1.png"/>
+            <wp:docPr id="5351" name="figura1.png"/>
             <a:graphic>
               <a:graphicData uri="http://schemas.openxmlformats.org/drawingml/2006/picture">
                 <pic:pic>
@@ -1313,7 +1313,7 @@
                   <pic:spPr>
                     <a:xfrm>
                       <a:off x="0" y="0"/>
-                      <a:ext cx="5120640" cy="3929793"/>
+                      <a:ext cx="3840480" cy="3840480"/>
                     </a:xfrm>
                     <a:prstGeom prst="rect">
                       <a:avLst/>
@@ -2189,9 +2189,9 @@
         </w:rPr>
         <w:drawing>
           <wp:inline distB="0" distT="0" distL="0" distR="0">
-            <wp:extent cx="4937760" cy="4018149"/>
+            <wp:extent cx="5394960" cy="3277016"/>
             <wp:effectExtent b="0" l="0" r="0" t="0"/>
-            <wp:docPr id="8727" name="figura3.png"/>
+            <wp:docPr id="1609" name="figura3.png"/>
             <a:graphic>
               <a:graphicData uri="http://schemas.openxmlformats.org/drawingml/2006/picture">
                 <pic:pic>
@@ -2209,7 +2209,7 @@
                   <pic:spPr>
                     <a:xfrm>
                       <a:off x="0" y="0"/>
-                      <a:ext cx="4937760" cy="4018149"/>
+                      <a:ext cx="5394960" cy="3277016"/>
                     </a:xfrm>
                     <a:prstGeom prst="rect">
                       <a:avLst/>
@@ -2442,9 +2442,9 @@
         </w:rPr>
         <w:drawing>
           <wp:inline distB="0" distT="0" distL="0" distR="0">
-            <wp:extent cx="5120640" cy="4210304"/>
+            <wp:extent cx="5394960" cy="3220713"/>
             <wp:effectExtent b="0" l="0" r="0" t="0"/>
-            <wp:docPr id="4834" name="figura2.png"/>
+            <wp:docPr id="6517" name="figura2.png"/>
             <a:graphic>
               <a:graphicData uri="http://schemas.openxmlformats.org/drawingml/2006/picture">
                 <pic:pic>
@@ -2462,7 +2462,7 @@
                   <pic:spPr>
                     <a:xfrm>
                       <a:off x="0" y="0"/>
-                      <a:ext cx="5120640" cy="4210304"/>
+                      <a:ext cx="5394960" cy="3220713"/>
                     </a:xfrm>
                     <a:prstGeom prst="rect">
                       <a:avLst/>

</xml_diff>